<commit_message>
Adding few more files, mostly docs
</commit_message>
<xml_diff>
--- a/docs/ASpectrum_Architecture.docx
+++ b/docs/ASpectrum_Architecture.docx
@@ -43,7 +43,7 @@
           <w:sz w:val="20"/>
           <w:szCs w:val="20"/>
         </w:rPr>
-        <w:t xml:space="preserve">Design state of 8 October 2026: the 128K machine (on hardware since 6 October) and the SD card tape loader with saving</w:t>
+        <w:t xml:space="preserve">Design state of 9 October 2026: the 128K machine (on hardware since 6 October), the SD card tape loader with saving, .z80 snapshots and memory contention</w:t>
       </w:r>
     </w:p>
     <w:sdt>
@@ -509,14 +509,15 @@
         </w:p>
         <w:p>
           <w:pPr>
-            <w:pStyle w:val="TOC1"/>
+            <w:pStyle w:val="TOC2"/>
             <w:tabs>
               <w:tab w:val="right" w:pos="9360" w:leader="dot"/>
             </w:tabs>
+            <w:ind w:left="220"/>
           </w:pPr>
           <w:hyperlink w:history="1" w:anchor="_Toc21">
             <w:r>
-              <w:t xml:space="preserve">10. Pins</w:t>
+              <w:t xml:space="preserve">9.5 Snapshots</w:t>
             </w:r>
             <w:r>
               <w:tab/>
@@ -538,7 +539,7 @@
           </w:pPr>
           <w:hyperlink w:history="1" w:anchor="_Toc22">
             <w:r>
-              <w:t xml:space="preserve">11. Timing constraints</w:t>
+              <w:t xml:space="preserve">10. Pins</w:t>
             </w:r>
             <w:r>
               <w:tab/>
@@ -560,7 +561,7 @@
           </w:pPr>
           <w:hyperlink w:history="1" w:anchor="_Toc23">
             <w:r>
-              <w:t xml:space="preserve">12. Verification</w:t>
+              <w:t xml:space="preserve">11. Timing constraints</w:t>
             </w:r>
             <w:r>
               <w:tab/>
@@ -582,7 +583,7 @@
           </w:pPr>
           <w:hyperlink w:history="1" w:anchor="_Toc24">
             <w:r>
-              <w:t xml:space="preserve">13. Known limitations</w:t>
+              <w:t xml:space="preserve">12. Verification</w:t>
             </w:r>
             <w:r>
               <w:tab/>
@@ -590,6 +591,28 @@
             <w:r>
               <w:fldChar w:fldCharType="begin" w:dirty="true"/>
               <w:instrText xml:space="preserve">PAGEREF _Toc24 \h</w:instrText>
+              <w:fldChar w:fldCharType="separate"/>
+              <w:fldChar w:fldCharType="end"/>
+            </w:r>
+          </w:hyperlink>
+        </w:p>
+        <w:p>
+          <w:pPr>
+            <w:pStyle w:val="TOC1"/>
+            <w:tabs>
+              <w:tab w:val="right" w:pos="9360" w:leader="dot"/>
+            </w:tabs>
+          </w:pPr>
+          <w:hyperlink w:history="1" w:anchor="_Toc25">
+            <w:r>
+              <w:t xml:space="preserve">13. Known limitations</w:t>
+            </w:r>
+            <w:r>
+              <w:tab/>
+            </w:r>
+            <w:r>
+              <w:fldChar w:fldCharType="begin" w:dirty="true"/>
+              <w:instrText xml:space="preserve">PAGEREF _Toc25 \h</w:instrText>
               <w:fldChar w:fldCharType="separate"/>
               <w:fldChar w:fldCharType="end"/>
             </w:r>
@@ -764,7 +787,25 @@
           <w:sz w:val="21"/>
           <w:szCs w:val="21"/>
         </w:rPr>
-        <w:t xml:space="preserve"> the Spectrum's SAVE output as .tap files, controlled from on-screen dialogs, and USB-keyboard machine keys (DiagROM, 50/60 Hz, reset).</w:t>
+        <w:t xml:space="preserve"> the Spectrum's SAVE output as .tap files, </w:t>
+      </w:r>
+      <w:r>
+        <w:rPr>
+          <w:rFonts w:ascii="Calibri" w:cs="Calibri" w:eastAsia="Calibri" w:hAnsi="Calibri"/>
+          <w:b/>
+          <w:bCs/>
+          <w:sz w:val="21"/>
+          <w:szCs w:val="21"/>
+        </w:rPr>
+        <w:t xml:space="preserve">.z80 snapshots</w:t>
+      </w:r>
+      <w:r>
+        <w:rPr>
+          <w:rFonts w:ascii="Calibri" w:cs="Calibri" w:eastAsia="Calibri" w:hAnsi="Calibri"/>
+          <w:sz w:val="21"/>
+          <w:szCs w:val="21"/>
+        </w:rPr>
+        <w:t xml:space="preserve"> (F2 saves the whole machine at any moment, the browser loads them), controlled from on-screen dialogs, and USB-keyboard machine keys (DiagROM, 50/60 Hz, reset).</w:t>
       </w:r>
     </w:p>
     <w:tbl>
@@ -1181,7 +1222,7 @@
                 <w:sz w:val="19"/>
                 <w:szCs w:val="19"/>
               </w:rPr>
-              <w:t xml:space="preserve">8,379 logic elements (54 %), 55 of 56 M9K, 2 PLLs, 72 pins</w:t>
+              <w:t xml:space="preserve">9,233 logic elements (60 %), 55 of 56 M9K, 2 PLLs, 71 pins</w:t>
             </w:r>
           </w:p>
         </w:tc>
@@ -1237,7 +1278,7 @@
                 <w:sz w:val="19"/>
                 <w:szCs w:val="19"/>
               </w:rPr>
-              <w:t xml:space="preserve">worst setup slack +0.47 ns (112 MHz, slow 85 °C corner), +1.87 ns at 56 MHz, no negative slack at any corner, no unconstrained paths</w:t>
+              <w:t xml:space="preserve">worst setup slack +0.52 ns (112 MHz, slow 85 °C corner), worst hold +0.15 ns, no negative slack at any corner, no unconstrained paths</w:t>
             </w:r>
           </w:p>
         </w:tc>
@@ -2395,7 +2436,7 @@
                 <w:sz w:val="19"/>
                 <w:szCs w:val="19"/>
               </w:rPr>
-              <w:t xml:space="preserve">SD card tape loader: RISC-V CPU, RAM, SPI, command FIFO, pulse player, recorder (saving)</w:t>
+              <w:t xml:space="preserve">SD card tape loader: RISC-V CPU, RAM, SPI, command FIFO, pulse player, recorder (saving), snapshot port</w:t>
             </w:r>
           </w:p>
         </w:tc>
@@ -2723,7 +2764,7 @@
                 <w:sz w:val="19"/>
                 <w:szCs w:val="19"/>
               </w:rPr>
-              <w:t xml:space="preserve">PLL inputs; video mode switch sequencer and 50/60 switch debounce</w:t>
+              <w:t xml:space="preserve">PLL inputs; video mode switch sequencer</w:t>
             </w:r>
           </w:p>
         </w:tc>
@@ -3321,6 +3362,62 @@
           <w:szCs w:val="21"/>
         </w:rPr>
         <w:t xml:space="preserve"> the tape loader can stop the CEN (like a memory wait) while it needs time during a save; the Spectrum does not notice, because its T-states stop too.</w:t>
+      </w:r>
+    </w:p>
+    <w:p>
+      <w:pPr>
+        <w:pStyle w:val="ListParagraph"/>
+        <w:numPr>
+          <w:ilvl w:val="0"/>
+          <w:numId w:val="2"/>
+        </w:numPr>
+        <w:spacing w:after="50"/>
+      </w:pPr>
+      <w:r>
+        <w:rPr>
+          <w:rFonts w:ascii="Calibri" w:cs="Calibri" w:eastAsia="Calibri" w:hAnsi="Calibri"/>
+          <w:b/>
+          <w:bCs/>
+          <w:sz w:val="21"/>
+          <w:szCs w:val="21"/>
+        </w:rPr>
+        <w:t xml:space="preserve">Snapshot freeze:</w:t>
+      </w:r>
+      <w:r>
+        <w:rPr>
+          <w:rFonts w:ascii="Calibri" w:cs="Calibri" w:eastAsia="Calibri" w:hAnsi="Calibri"/>
+          <w:sz w:val="21"/>
+          <w:szCs w:val="21"/>
+        </w:rPr>
+        <w:t xml:space="preserve"> the tape loader can stop the CEN at an instruction boundary (section 9.5).</w:t>
+      </w:r>
+    </w:p>
+    <w:p>
+      <w:pPr>
+        <w:pStyle w:val="ListParagraph"/>
+        <w:numPr>
+          <w:ilvl w:val="0"/>
+          <w:numId w:val="2"/>
+        </w:numPr>
+        <w:spacing w:after="50"/>
+      </w:pPr>
+      <w:r>
+        <w:rPr>
+          <w:rFonts w:ascii="Calibri" w:cs="Calibri" w:eastAsia="Calibri" w:hAnsi="Calibri"/>
+          <w:b/>
+          <w:bCs/>
+          <w:sz w:val="21"/>
+          <w:szCs w:val="21"/>
+        </w:rPr>
+        <w:t xml:space="preserve">Memory contention (Level 1, 128K timing):</w:t>
+      </w:r>
+      <w:r>
+        <w:rPr>
+          <w:rFonts w:ascii="Calibri" w:cs="Calibri" w:eastAsia="Calibri" w:hAnsi="Calibri"/>
+          <w:sz w:val="21"/>
+          <w:szCs w:val="21"/>
+        </w:rPr>
+        <w:t xml:space="preserve"> a frame T-state counter restarts at each interrupt and counts real T-states. At the start of each memory cycle to 4000-7FFF (or to C000-FFFF while an odd RAM page is paged in), and in the I/O patterns of the 128K, the CEN is withheld by 6, 5, 4, 3, 2, 1, 0, 0 T-states during the 128 contended T-states of each of the 192 picture lines (from T-state 14,361). Those T-states are lost, as on the real machine, and the tape player counts them too. Off in turbo; F5 switches it off. Not emulated: the internal contended T-states of some instructions, the floating bus.</w:t>
       </w:r>
     </w:p>
     <w:p>
@@ -5262,7 +5359,7 @@
           <w:sz w:val="21"/>
           <w:szCs w:val="21"/>
         </w:rPr>
-        <w:t xml:space="preserve">The mode comes from the S1 switch (50 Hz when unwired) and is swapped with F8; it is kept across resets.</w:t>
+        <w:t xml:space="preserve">Power-up mode is 60 Hz (640x480, accepted by every monitor; 576p50 is not); F8 swaps it, and the choice is kept across resets. The adapter's 50/60 switch is not read.</w:t>
       </w:r>
     </w:p>
     <w:p>
@@ -5919,50 +6016,7 @@
           <w:sz w:val="21"/>
           <w:szCs w:val="21"/>
         </w:rPr>
-        <w:t xml:space="preserve">The 32-T-state interrupt comes from the VGA vertical sync in 50 Hz mode (a true 50.00 Hz frame), and from a 70,908-T-state counter (the 128K frame) in 60 Hz mode; the counter follows turbo.</w:t>
-      </w:r>
-    </w:p>
-    <w:p>
-      <w:pPr>
-        <w:pStyle w:val="Heading1"/>
-        <w:spacing w:after="120" w:before="320"/>
-      </w:pPr>
-      <w:bookmarkStart w:name="_Toc15" w:id="15"/>
-      <w:r>
-        <w:rPr>
-          <w:rFonts w:ascii="Calibri" w:cs="Calibri" w:eastAsia="Calibri" w:hAnsi="Calibri"/>
-        </w:rPr>
-        <w:t xml:space="preserve">8. Keyboard and controls</w:t>
-      </w:r>
-      <w:bookmarkEnd w:id="15"/>
-    </w:p>
-    <w:p>
-      <w:pPr>
-        <w:spacing w:after="110"/>
-      </w:pPr>
-      <w:r>
-        <w:rPr>
-          <w:rFonts w:ascii="Calibri" w:cs="Calibri" w:eastAsia="Calibri" w:hAnsi="Calibri"/>
-          <w:sz w:val="21"/>
-          <w:szCs w:val="21"/>
-        </w:rPr>
-        <w:t xml:space="preserve">A USB keyboard is attached through a CH9350-style module that sends HID reports over a 115,200-baud UART. </w:t>
-      </w:r>
-      <w:r>
-        <w:rPr>
-          <w:rFonts w:ascii="Consolas" w:cs="Consolas" w:eastAsia="Consolas" w:hAnsi="Consolas"/>
-          <w:sz w:val="19"/>
-          <w:szCs w:val="19"/>
-        </w:rPr>
-        <w:t xml:space="preserve">zx_keyboard.v</w:t>
-      </w:r>
-      <w:r>
-        <w:rPr>
-          <w:rFonts w:ascii="Calibri" w:cs="Calibri" w:eastAsia="Calibri" w:hAnsi="Calibri"/>
-          <w:sz w:val="21"/>
-          <w:szCs w:val="21"/>
-        </w:rPr>
-        <w:t xml:space="preserve"> decodes the modifier byte and the first three key codes of each report into the 8 x 5 Spectrum key matrix, plus extras:</w:t>
+        <w:t xml:space="preserve">The 32-T-state interrupt comes from the video in 50 Hz mode (a true 50.00 Hz frame) and from a 70,908-T-state counter (the 128K frame) in 60 Hz mode; the counter follows turbo.</w:t>
       </w:r>
     </w:p>
     <w:p>
@@ -5980,7 +6034,7 @@
           <w:sz w:val="21"/>
           <w:szCs w:val="21"/>
         </w:rPr>
-        <w:t xml:space="preserve">PC keys mapped to Spectrum combinations: Backspace = DELETE, arrows = cursor keys, Esc = BREAK, Left Shift = CAPS SHIFT, Right Shift / Ctrl = SYMBOL SHIFT.</w:t>
+        <w:t xml:space="preserve">In 50 Hz mode the interrupt fires at a set point of the VGA frame, so that border effects line up with the picture: VGA line 24, pixel 166 after the start of vsync, measured with Aquaplane's horizon stripe. Page Up / Page Down (browser closed) move it in 1/8-line steps. Calculated for a real 128K it would be line 12.7; the difference is most likely the contention that is not emulated (Level 2).</w:t>
       </w:r>
     </w:p>
     <w:p>
@@ -5995,20 +6049,53 @@
       <w:r>
         <w:rPr>
           <w:rFonts w:ascii="Calibri" w:cs="Calibri" w:eastAsia="Calibri" w:hAnsi="Calibri"/>
-          <w:b/>
-          <w:bCs/>
-          <w:sz w:val="21"/>
-          <w:szCs w:val="21"/>
-        </w:rPr>
-        <w:t xml:space="preserve">Machine keys</w:t>
-      </w:r>
-      <w:r>
-        <w:rPr>
-          <w:rFonts w:ascii="Calibri" w:cs="Calibri" w:eastAsia="Calibri" w:hAnsi="Calibri"/>
-          <w:sz w:val="21"/>
-          <w:szCs w:val="21"/>
-        </w:rPr>
-        <w:t xml:space="preserve"> handled in hardware: F1 held at start (DiagROM), F8 (50/60 Hz), Ctrl+Alt+Del (machine reset).</w:t>
+          <w:sz w:val="21"/>
+          <w:szCs w:val="21"/>
+        </w:rPr>
+        <w:t xml:space="preserve">In 60 Hz mode the picture is not locked to the Spectrum frame (59.5 Hz video, 50 Hz interrupts), so border effects cannot line up.</w:t>
+      </w:r>
+    </w:p>
+    <w:p>
+      <w:pPr>
+        <w:pStyle w:val="Heading1"/>
+        <w:spacing w:after="120" w:before="320"/>
+      </w:pPr>
+      <w:bookmarkStart w:name="_Toc15" w:id="15"/>
+      <w:r>
+        <w:rPr>
+          <w:rFonts w:ascii="Calibri" w:cs="Calibri" w:eastAsia="Calibri" w:hAnsi="Calibri"/>
+        </w:rPr>
+        <w:t xml:space="preserve">8. Keyboard and controls</w:t>
+      </w:r>
+      <w:bookmarkEnd w:id="15"/>
+    </w:p>
+    <w:p>
+      <w:pPr>
+        <w:spacing w:after="110"/>
+      </w:pPr>
+      <w:r>
+        <w:rPr>
+          <w:rFonts w:ascii="Calibri" w:cs="Calibri" w:eastAsia="Calibri" w:hAnsi="Calibri"/>
+          <w:sz w:val="21"/>
+          <w:szCs w:val="21"/>
+        </w:rPr>
+        <w:t xml:space="preserve">A USB keyboard is attached through a CH9350-style module that sends HID reports over a 115,200-baud UART. </w:t>
+      </w:r>
+      <w:r>
+        <w:rPr>
+          <w:rFonts w:ascii="Consolas" w:cs="Consolas" w:eastAsia="Consolas" w:hAnsi="Consolas"/>
+          <w:sz w:val="19"/>
+          <w:szCs w:val="19"/>
+        </w:rPr>
+        <w:t xml:space="preserve">zx_keyboard.v</w:t>
+      </w:r>
+      <w:r>
+        <w:rPr>
+          <w:rFonts w:ascii="Calibri" w:cs="Calibri" w:eastAsia="Calibri" w:hAnsi="Calibri"/>
+          <w:sz w:val="21"/>
+          <w:szCs w:val="21"/>
+        </w:rPr>
+        <w:t xml:space="preserve"> decodes the modifier byte and the first three key codes of each report into the 8 x 5 Spectrum key matrix, plus extras:</w:t>
       </w:r>
     </w:p>
     <w:p>
@@ -6023,11 +6110,57 @@
       <w:r>
         <w:rPr>
           <w:rFonts w:ascii="Calibri" w:cs="Calibri" w:eastAsia="Calibri" w:hAnsi="Calibri"/>
+          <w:sz w:val="21"/>
+          <w:szCs w:val="21"/>
+        </w:rPr>
+        <w:t xml:space="preserve">PC keys mapped to Spectrum combinations: Backspace = DELETE, arrows = cursor keys, Esc = BREAK, Left Shift = CAPS SHIFT, Right Shift / Ctrl = SYMBOL SHIFT.</w:t>
+      </w:r>
+    </w:p>
+    <w:p>
+      <w:pPr>
+        <w:pStyle w:val="ListParagraph"/>
+        <w:numPr>
+          <w:ilvl w:val="0"/>
+          <w:numId w:val="2"/>
+        </w:numPr>
+        <w:spacing w:after="50"/>
+      </w:pPr>
+      <w:r>
+        <w:rPr>
+          <w:rFonts w:ascii="Calibri" w:cs="Calibri" w:eastAsia="Calibri" w:hAnsi="Calibri"/>
           <w:b/>
           <w:bCs/>
           <w:sz w:val="21"/>
           <w:szCs w:val="21"/>
         </w:rPr>
+        <w:t xml:space="preserve">Machine keys</w:t>
+      </w:r>
+      <w:r>
+        <w:rPr>
+          <w:rFonts w:ascii="Calibri" w:cs="Calibri" w:eastAsia="Calibri" w:hAnsi="Calibri"/>
+          <w:sz w:val="21"/>
+          <w:szCs w:val="21"/>
+        </w:rPr>
+        <w:t xml:space="preserve"> handled in hardware: F1 held at start (DiagROM), F8 (50/60 Hz), Ctrl+Alt+Del (machine reset).</w:t>
+      </w:r>
+    </w:p>
+    <w:p>
+      <w:pPr>
+        <w:pStyle w:val="ListParagraph"/>
+        <w:numPr>
+          <w:ilvl w:val="0"/>
+          <w:numId w:val="2"/>
+        </w:numPr>
+        <w:spacing w:after="50"/>
+      </w:pPr>
+      <w:r>
+        <w:rPr>
+          <w:rFonts w:ascii="Calibri" w:cs="Calibri" w:eastAsia="Calibri" w:hAnsi="Calibri"/>
+          <w:b/>
+          <w:bCs/>
+          <w:sz w:val="21"/>
+          <w:szCs w:val="21"/>
+        </w:rPr>
         <w:t xml:space="preserve">Loader keys</w:t>
       </w:r>
       <w:r>
@@ -6036,7 +6169,7 @@
           <w:sz w:val="21"/>
           <w:szCs w:val="21"/>
         </w:rPr>
-        <w:t xml:space="preserve"> passed to the tape loader CPU as a bit vector: F12 / numpad keys / arrows / Enter / Esc / F6 (speed) / F7 (stop) / F9-F11; plus the raw keyboard report for typing file names.</w:t>
+        <w:t xml:space="preserve"> passed to the tape loader CPU as a bit vector: F12 / numpad keys / arrows / Enter / Esc / F2 (snapshot) / F5 (contention) / F6 (speed) / F7 (stop) / F9-F11 / Page Up / Page Down (browser paging, or the 50 Hz interrupt position); plus the raw keyboard report for typing file names.</w:t>
       </w:r>
     </w:p>
     <w:p>
@@ -6865,7 +6998,7 @@
           <w:sz w:val="21"/>
           <w:szCs w:val="21"/>
         </w:rPr>
-        <w:t xml:space="preserve"> sorted folder lists (up to 400 entries) on the OSD, keys with auto-repeat, pause, back one block, stop, turbo/normal speed (F6), and "stop the tape" blocks for multi-load games.</w:t>
+        <w:t xml:space="preserve"> sorted folder lists (up to 350 entries) on the OSD, keys with auto-repeat, pause, back one block, stop, turbo/normal speed (F6), and "stop the tape" blocks for multi-load games.</w:t>
       </w:r>
     </w:p>
     <w:p>
@@ -6898,6 +7031,34 @@
     </w:p>
     <w:p>
       <w:pPr>
+        <w:pStyle w:val="ListParagraph"/>
+        <w:numPr>
+          <w:ilvl w:val="0"/>
+          <w:numId w:val="2"/>
+        </w:numPr>
+        <w:spacing w:after="50"/>
+      </w:pPr>
+      <w:r>
+        <w:rPr>
+          <w:rFonts w:ascii="Calibri" w:cs="Calibri" w:eastAsia="Calibri" w:hAnsi="Calibri"/>
+          <w:b/>
+          <w:bCs/>
+          <w:sz w:val="21"/>
+          <w:szCs w:val="21"/>
+        </w:rPr>
+        <w:t xml:space="preserve">Snapshots:</w:t>
+      </w:r>
+      <w:r>
+        <w:rPr>
+          <w:rFonts w:ascii="Calibri" w:cs="Calibri" w:eastAsia="Calibri" w:hAnsi="Calibri"/>
+          <w:sz w:val="21"/>
+          <w:szCs w:val="21"/>
+        </w:rPr>
+        <w:t xml:space="preserve"> .z80 version 3 writer (pages compressed in two passes: length, then data) and a loader for versions 1-3, 48K and 128K, that checks the whole file before changing anything.</w:t>
+      </w:r>
+    </w:p>
+    <w:p>
+      <w:pPr>
         <w:spacing w:after="110"/>
       </w:pPr>
       <w:r>
@@ -6906,7 +7067,7 @@
           <w:sz w:val="21"/>
           <w:szCs w:val="21"/>
         </w:rPr>
-        <w:t xml:space="preserve">The firmware is 12.6 KB of code plus about 17 KB of data; all variables are cleared at start, because a reset does not reload the RAM image.</w:t>
+        <w:t xml:space="preserve">The firmware is 15.7 KB of code plus 15.3 KB of data (built with shared prologue/epilogue code, -msave-restore); all variables are cleared at start, because a reset does not reload the RAM image. The browser limit went from 400 to 350 entries to make room for the snapshot code.</w:t>
       </w:r>
     </w:p>
     <w:p>
@@ -6938,17 +7099,174 @@
     </w:p>
     <w:p>
       <w:pPr>
+        <w:pStyle w:val="Heading2"/>
+        <w:spacing w:after="100" w:before="220"/>
+      </w:pPr>
+      <w:bookmarkStart w:name="_Toc21" w:id="21"/>
+      <w:r>
+        <w:rPr>
+          <w:rFonts w:ascii="Calibri" w:cs="Calibri" w:eastAsia="Calibri" w:hAnsi="Calibri"/>
+        </w:rPr>
+        <w:t xml:space="preserve">9.5 Snapshots</w:t>
+      </w:r>
+      <w:bookmarkEnd w:id="21"/>
+    </w:p>
+    <w:p>
+      <w:pPr>
+        <w:spacing w:after="110"/>
+      </w:pPr>
+      <w:r>
+        <w:rPr>
+          <w:rFonts w:ascii="Calibri" w:cs="Calibri" w:eastAsia="Calibri" w:hAnsi="Calibri"/>
+          <w:sz w:val="21"/>
+          <w:szCs w:val="21"/>
+        </w:rPr>
+        <w:t xml:space="preserve">F2 saves the whole machine as a .z80 file (version 3, 128K): the 8 RAM pages, every CPU register, port 7FFD, border, the AY registers and its register select. Choosing a .z80 file in the browser loads it (versions 1-3; 48K snapshots run in 48K mode with 7FFD = 30h).</w:t>
+      </w:r>
+    </w:p>
+    <w:p>
+      <w:pPr>
+        <w:pStyle w:val="ListParagraph"/>
+        <w:numPr>
+          <w:ilvl w:val="0"/>
+          <w:numId w:val="2"/>
+        </w:numPr>
+        <w:spacing w:after="50"/>
+      </w:pPr>
+      <w:r>
+        <w:rPr>
+          <w:rFonts w:ascii="Calibri" w:cs="Calibri" w:eastAsia="Calibri" w:hAnsi="Calibri"/>
+          <w:b/>
+          <w:bCs/>
+          <w:sz w:val="21"/>
+          <w:szCs w:val="21"/>
+        </w:rPr>
+        <w:t xml:space="preserve">Freeze at an instruction boundary</w:t>
+      </w:r>
+      <w:r>
+        <w:rPr>
+          <w:rFonts w:ascii="Calibri" w:cs="Calibri" w:eastAsia="Calibri" w:hAnsi="Calibri"/>
+          <w:sz w:val="21"/>
+          <w:szCs w:val="21"/>
+        </w:rPr>
+        <w:t xml:space="preserve"> (zx_bus): the CEN stops in T2 of an opcode fetch that is not an interrupt acknowledge and does not follow a CB/ED/DD/FD prefix (tracked from the fetched opcodes). There the T80 has written back the previous instruction (at T1) and not yet taken the opcode or incremented PC and R, so its registers are the state between two instructions. In HALT the PC is already past the HALT: the firmware saves PC - 1.</w:t>
+      </w:r>
+    </w:p>
+    <w:p>
+      <w:pPr>
+        <w:pStyle w:val="ListParagraph"/>
+        <w:numPr>
+          <w:ilvl w:val="0"/>
+          <w:numId w:val="2"/>
+        </w:numPr>
+        <w:spacing w:after="50"/>
+      </w:pPr>
+      <w:r>
+        <w:rPr>
+          <w:rFonts w:ascii="Calibri" w:cs="Calibri" w:eastAsia="Calibri" w:hAnsi="Calibri"/>
+          <w:b/>
+          <w:bCs/>
+          <w:sz w:val="21"/>
+          <w:szCs w:val="21"/>
+        </w:rPr>
+        <w:t xml:space="preserve">Registers</w:t>
+      </w:r>
+      <w:r>
+        <w:rPr>
+          <w:rFonts w:ascii="Calibri" w:cs="Calibri" w:eastAsia="Calibri" w:hAnsi="Calibri"/>
+          <w:sz w:val="21"/>
+          <w:szCs w:val="21"/>
+        </w:rPr>
+        <w:t xml:space="preserve"> are read from the T80's REG output; loading resets the T80 alone and loads every register at once through its DIRSet/DIR port (the MiSTer way), then the CPU starts a fresh opcode fetch at the saved PC.</w:t>
+      </w:r>
+    </w:p>
+    <w:p>
+      <w:pPr>
+        <w:pStyle w:val="ListParagraph"/>
+        <w:numPr>
+          <w:ilvl w:val="0"/>
+          <w:numId w:val="2"/>
+        </w:numPr>
+        <w:spacing w:after="50"/>
+      </w:pPr>
+      <w:r>
+        <w:rPr>
+          <w:rFonts w:ascii="Calibri" w:cs="Calibri" w:eastAsia="Calibri" w:hAnsi="Calibri"/>
+          <w:b/>
+          <w:bCs/>
+          <w:sz w:val="21"/>
+          <w:szCs w:val="21"/>
+        </w:rPr>
+        <w:t xml:space="preserve">Command port</w:t>
+      </w:r>
+      <w:r>
+        <w:rPr>
+          <w:rFonts w:ascii="Calibri" w:cs="Calibri" w:eastAsia="Calibri" w:hAnsi="Calibri"/>
+          <w:sz w:val="21"/>
+          <w:szCs w:val="21"/>
+        </w:rPr>
+        <w:t xml:space="preserve"> (loader to zx_bus, request toggle + acknowledge): SDRAM byte read / write (writes also update the screen shadows), register word read, register word write + LOAD, AY register read / write / select, ports (7FFD, border), state (HALT, AY select, ports).</w:t>
+      </w:r>
+    </w:p>
+    <w:p>
+      <w:pPr>
+        <w:pStyle w:val="ListParagraph"/>
+        <w:numPr>
+          <w:ilvl w:val="0"/>
+          <w:numId w:val="2"/>
+        </w:numPr>
+        <w:spacing w:after="50"/>
+      </w:pPr>
+      <w:r>
+        <w:rPr>
+          <w:rFonts w:ascii="Calibri" w:cs="Calibri" w:eastAsia="Calibri" w:hAnsi="Calibri"/>
+          <w:b/>
+          <w:bCs/>
+          <w:sz w:val="21"/>
+          <w:szCs w:val="21"/>
+        </w:rPr>
+        <w:t xml:space="preserve">Unfreeze:</w:t>
+      </w:r>
+      <w:r>
+        <w:rPr>
+          <w:rFonts w:ascii="Calibri" w:cs="Calibri" w:eastAsia="Calibri" w:hAnsi="Calibri"/>
+          <w:sz w:val="21"/>
+          <w:szCs w:val="21"/>
+        </w:rPr>
+        <w:t xml:space="preserve"> the opcode read of the stopped M1 is repeated (the loader's SDRAM reads changed the data bus), so the program continues as if nothing happened; T-states stopped too, so a playing tape stays in step.</w:t>
+      </w:r>
+    </w:p>
+    <w:p>
+      <w:pPr>
+        <w:pStyle w:val="ListParagraph"/>
+        <w:numPr>
+          <w:ilvl w:val="0"/>
+          <w:numId w:val="2"/>
+        </w:numPr>
+        <w:spacing w:after="50"/>
+      </w:pPr>
+      <w:r>
+        <w:rPr>
+          <w:rFonts w:ascii="Calibri" w:cs="Calibri" w:eastAsia="Calibri" w:hAnsi="Calibri"/>
+          <w:sz w:val="21"/>
+          <w:szCs w:val="21"/>
+        </w:rPr>
+        <w:t xml:space="preserve">Not saved: the position inside the video frame; after a load the next interrupt comes at a different point of the frame (the T80's reset state also costs one T-state).</w:t>
+      </w:r>
+    </w:p>
+    <w:p>
+      <w:pPr>
         <w:pStyle w:val="Heading1"/>
         <w:spacing w:after="120" w:before="320"/>
       </w:pPr>
-      <w:bookmarkStart w:name="_Toc21" w:id="21"/>
+      <w:bookmarkStart w:name="_Toc22" w:id="22"/>
       <w:r>
         <w:rPr>
           <w:rFonts w:ascii="Calibri" w:cs="Calibri" w:eastAsia="Calibri" w:hAnsi="Calibri"/>
         </w:rPr>
         <w:t xml:space="preserve">10. Pins</w:t>
       </w:r>
-      <w:bookmarkEnd w:id="21"/>
+      <w:bookmarkEnd w:id="22"/>
     </w:p>
     <w:tbl>
       <w:tblPr>
@@ -8002,89 +8320,6 @@
                 <w:sz w:val="19"/>
                 <w:szCs w:val="19"/>
               </w:rPr>
-              <w:t xml:space="preserve">SW_50_60</w:t>
-            </w:r>
-          </w:p>
-        </w:tc>
-        <w:tc>
-          <w:tcPr>
-            <w:tcW w:type="dxa" w:w="1500"/>
-            <w:tcBorders>
-              <w:top w:val="single" w:color="A6A6A6" w:sz="4"/>
-              <w:left w:val="single" w:color="A6A6A6" w:sz="4"/>
-              <w:bottom w:val="single" w:color="A6A6A6" w:sz="4"/>
-              <w:right w:val="single" w:color="A6A6A6" w:sz="4"/>
-            </w:tcBorders>
-            <w:tcMar>
-              <w:top w:type="dxa" w:w="50"/>
-              <w:left w:type="dxa" w:w="90"/>
-              <w:bottom w:type="dxa" w:w="50"/>
-              <w:right w:type="dxa" w:w="90"/>
-            </w:tcMar>
-          </w:tcPr>
-          <w:p>
-            <w:r>
-              <w:rPr>
-                <w:rFonts w:ascii="Calibri" w:cs="Calibri" w:eastAsia="Calibri" w:hAnsi="Calibri"/>
-                <w:sz w:val="19"/>
-                <w:szCs w:val="19"/>
-              </w:rPr>
-              <w:t xml:space="preserve">D2</w:t>
-            </w:r>
-          </w:p>
-        </w:tc>
-        <w:tc>
-          <w:tcPr>
-            <w:tcW w:type="dxa" w:w="5360"/>
-            <w:tcBorders>
-              <w:top w:val="single" w:color="A6A6A6" w:sz="4"/>
-              <w:left w:val="single" w:color="A6A6A6" w:sz="4"/>
-              <w:bottom w:val="single" w:color="A6A6A6" w:sz="4"/>
-              <w:right w:val="single" w:color="A6A6A6" w:sz="4"/>
-            </w:tcBorders>
-            <w:tcMar>
-              <w:top w:type="dxa" w:w="50"/>
-              <w:left w:type="dxa" w:w="90"/>
-              <w:bottom w:type="dxa" w:w="50"/>
-              <w:right w:type="dxa" w:w="90"/>
-            </w:tcMar>
-          </w:tcPr>
-          <w:p>
-            <w:r>
-              <w:rPr>
-                <w:rFonts w:ascii="Calibri" w:cs="Calibri" w:eastAsia="Calibri" w:hAnsi="Calibri"/>
-                <w:sz w:val="19"/>
-                <w:szCs w:val="19"/>
-              </w:rPr>
-              <w:t xml:space="preserve">adapter J1 wired to U7.22 (pull-up = 50 Hz)</w:t>
-            </w:r>
-          </w:p>
-        </w:tc>
-      </w:tr>
-      <w:tr>
-        <w:tc>
-          <w:tcPr>
-            <w:tcW w:type="dxa" w:w="2500"/>
-            <w:tcBorders>
-              <w:top w:val="single" w:color="A6A6A6" w:sz="4"/>
-              <w:left w:val="single" w:color="A6A6A6" w:sz="4"/>
-              <w:bottom w:val="single" w:color="A6A6A6" w:sz="4"/>
-              <w:right w:val="single" w:color="A6A6A6" w:sz="4"/>
-            </w:tcBorders>
-            <w:tcMar>
-              <w:top w:type="dxa" w:w="50"/>
-              <w:left w:type="dxa" w:w="90"/>
-              <w:bottom w:type="dxa" w:w="50"/>
-              <w:right w:type="dxa" w:w="90"/>
-            </w:tcMar>
-          </w:tcPr>
-          <w:p>
-            <w:r>
-              <w:rPr>
-                <w:rFonts w:ascii="Calibri" w:cs="Calibri" w:eastAsia="Calibri" w:hAnsi="Calibri"/>
-                <w:sz w:val="19"/>
-                <w:szCs w:val="19"/>
-              </w:rPr>
               <w:t xml:space="preserve">SD_MOSI / MISO / SCK / CS_N</w:t>
             </w:r>
           </w:p>
@@ -8168,14 +8403,14 @@
         <w:pStyle w:val="Heading1"/>
         <w:spacing w:after="120" w:before="320"/>
       </w:pPr>
-      <w:bookmarkStart w:name="_Toc22" w:id="22"/>
+      <w:bookmarkStart w:name="_Toc23" w:id="23"/>
       <w:r>
         <w:rPr>
           <w:rFonts w:ascii="Calibri" w:cs="Calibri" w:eastAsia="Calibri" w:hAnsi="Calibri"/>
         </w:rPr>
         <w:t xml:space="preserve">11. Timing constraints</w:t>
       </w:r>
-      <w:bookmarkEnd w:id="22"/>
+      <w:bookmarkEnd w:id="23"/>
     </w:p>
     <w:p>
       <w:pPr>
@@ -8272,14 +8507,14 @@
         <w:pStyle w:val="Heading1"/>
         <w:spacing w:after="120" w:before="320"/>
       </w:pPr>
-      <w:bookmarkStart w:name="_Toc23" w:id="23"/>
+      <w:bookmarkStart w:name="_Toc24" w:id="24"/>
       <w:r>
         <w:rPr>
           <w:rFonts w:ascii="Calibri" w:cs="Calibri" w:eastAsia="Calibri" w:hAnsi="Calibri"/>
         </w:rPr>
         <w:t xml:space="preserve">12. Verification</w:t>
       </w:r>
-      <w:bookmarkEnd w:id="23"/>
+      <w:bookmarkEnd w:id="24"/>
     </w:p>
     <w:tbl>
       <w:tblPr>
@@ -8583,7 +8818,7 @@
                 <w:sz w:val="19"/>
                 <w:szCs w:val="19"/>
               </w:rPr>
-              <w:t xml:space="preserve">Firmware on the PC against generated FAT16/FAT32 card images (fragmented files, long names): every listing and every TAP/TZX signal compared with an independent Python reference; recordings of real TAP files (noise, headerless, several saves, 1 s pauses in turbo, empty) written and checked by an independent FAT checker</w:t>
+              <w:t xml:space="preserve">Firmware on the PC against generated FAT16/FAT32 card images (fragmented files, long names): every listing and every TAP/TZX signal compared with an independent Python reference; recordings of real TAP files (noise, headerless, several saves, 1 s pauses in turbo, empty) written and checked by an independent FAT checker; snapshots: reference .z80 files (versions 1-3, 48K/128K, stored pages, bad files) loaded into a model of the hardware, and save + reload round trips checked by an independent .z80 decoder</w:t>
             </w:r>
           </w:p>
         </w:tc>
@@ -8612,7 +8847,7 @@
                 <w:sz w:val="19"/>
                 <w:szCs w:val="19"/>
               </w:rPr>
-              <w:t xml:space="preserve">DDR_TEST, VGA_TEST</w:t>
+              <w:t xml:space="preserve">sim/run_snap_sim.sh</w:t>
             </w:r>
           </w:p>
         </w:tc>
@@ -8639,7 +8874,7 @@
                 <w:sz w:val="19"/>
                 <w:szCs w:val="19"/>
               </w:rPr>
-              <w:t xml:space="preserve">Earlier stand-alone projects that proved the SDRAM controller and the video modes on the hardware</w:t>
+              <w:t xml:space="preserve">zx_bus + T80 + SDRAM: a Z80 test program (prefixes, DD CB, block instructions, EXX, IM 2, HALT, paging, AY) run undisturbed, with random freezes and reads, and with random freezes and full restores (LOAD): identical results</w:t>
             </w:r>
           </w:p>
         </w:tc>
@@ -8668,6 +8903,174 @@
                 <w:sz w:val="19"/>
                 <w:szCs w:val="19"/>
               </w:rPr>
+              <w:t xml:space="preserve">sim/run_cont_sim.sh</w:t>
+            </w:r>
+          </w:p>
+        </w:tc>
+        <w:tc>
+          <w:tcPr>
+            <w:tcW w:type="dxa" w:w="6260"/>
+            <w:tcBorders>
+              <w:top w:val="single" w:color="A6A6A6" w:sz="4"/>
+              <w:left w:val="single" w:color="A6A6A6" w:sz="4"/>
+              <w:bottom w:val="single" w:color="A6A6A6" w:sz="4"/>
+              <w:right w:val="single" w:color="A6A6A6" w:sz="4"/>
+            </w:tcBorders>
+            <w:tcMar>
+              <w:top w:type="dxa" w:w="50"/>
+              <w:left w:type="dxa" w:w="90"/>
+              <w:bottom w:type="dxa" w:w="50"/>
+              <w:right w:type="dxa" w:w="90"/>
+            </w:tcMar>
+          </w:tcPr>
+          <w:p>
+            <w:r>
+              <w:rPr>
+                <w:rFonts w:ascii="Calibri" w:cs="Calibri" w:eastAsia="Calibri" w:hAnsi="Calibri"/>
+                <w:sz w:val="19"/>
+                <w:szCs w:val="19"/>
+              </w:rPr>
+              <w:t xml:space="preserve">zx_bus + T80 + SDRAM: 8,000 NOPs in contended RAM run 57 per line in the border and 41 per picture line (the known Spectrum result), 57 everywhere with contention off</w:t>
+            </w:r>
+          </w:p>
+        </w:tc>
+      </w:tr>
+      <w:tr>
+        <w:tc>
+          <w:tcPr>
+            <w:tcW w:type="dxa" w:w="3100"/>
+            <w:tcBorders>
+              <w:top w:val="single" w:color="A6A6A6" w:sz="4"/>
+              <w:left w:val="single" w:color="A6A6A6" w:sz="4"/>
+              <w:bottom w:val="single" w:color="A6A6A6" w:sz="4"/>
+              <w:right w:val="single" w:color="A6A6A6" w:sz="4"/>
+            </w:tcBorders>
+            <w:tcMar>
+              <w:top w:type="dxa" w:w="50"/>
+              <w:left w:type="dxa" w:w="90"/>
+              <w:bottom w:type="dxa" w:w="50"/>
+              <w:right w:type="dxa" w:w="90"/>
+            </w:tcMar>
+          </w:tcPr>
+          <w:p>
+            <w:r>
+              <w:rPr>
+                <w:rFonts w:ascii="Calibri" w:cs="Calibri" w:eastAsia="Calibri" w:hAnsi="Calibri"/>
+                <w:sz w:val="19"/>
+                <w:szCs w:val="19"/>
+              </w:rPr>
+              <w:t xml:space="preserve">sim/run_snapsys_sim.sh</w:t>
+            </w:r>
+          </w:p>
+        </w:tc>
+        <w:tc>
+          <w:tcPr>
+            <w:tcW w:type="dxa" w:w="6260"/>
+            <w:tcBorders>
+              <w:top w:val="single" w:color="A6A6A6" w:sz="4"/>
+              <w:left w:val="single" w:color="A6A6A6" w:sz="4"/>
+              <w:bottom w:val="single" w:color="A6A6A6" w:sz="4"/>
+              <w:right w:val="single" w:color="A6A6A6" w:sz="4"/>
+            </w:tcBorders>
+            <w:tcMar>
+              <w:top w:type="dxa" w:w="50"/>
+              <w:left w:type="dxa" w:w="90"/>
+              <w:bottom w:type="dxa" w:w="50"/>
+              <w:right w:type="dxa" w:w="90"/>
+            </w:tcMar>
+          </w:tcPr>
+          <w:p>
+            <w:r>
+              <w:rPr>
+                <w:rFonts w:ascii="Calibri" w:cs="Calibri" w:eastAsia="Calibri" w:hAnsi="Calibri"/>
+                <w:sz w:val="19"/>
+                <w:szCs w:val="19"/>
+              </w:rPr>
+              <w:t xml:space="preserve">Whole machine with the firmware: F2, a typed name, the snapshot written to the SD card model, F12 + Enter loads it back; loaded state equals the saved state; the file is checked by the independent decoder</w:t>
+            </w:r>
+          </w:p>
+        </w:tc>
+      </w:tr>
+      <w:tr>
+        <w:tc>
+          <w:tcPr>
+            <w:tcW w:type="dxa" w:w="3100"/>
+            <w:tcBorders>
+              <w:top w:val="single" w:color="A6A6A6" w:sz="4"/>
+              <w:left w:val="single" w:color="A6A6A6" w:sz="4"/>
+              <w:bottom w:val="single" w:color="A6A6A6" w:sz="4"/>
+              <w:right w:val="single" w:color="A6A6A6" w:sz="4"/>
+            </w:tcBorders>
+            <w:tcMar>
+              <w:top w:type="dxa" w:w="50"/>
+              <w:left w:type="dxa" w:w="90"/>
+              <w:bottom w:type="dxa" w:w="50"/>
+              <w:right w:type="dxa" w:w="90"/>
+            </w:tcMar>
+          </w:tcPr>
+          <w:p>
+            <w:r>
+              <w:rPr>
+                <w:rFonts w:ascii="Calibri" w:cs="Calibri" w:eastAsia="Calibri" w:hAnsi="Calibri"/>
+                <w:sz w:val="19"/>
+                <w:szCs w:val="19"/>
+              </w:rPr>
+              <w:t xml:space="preserve">DDR_TEST, VGA_TEST</w:t>
+            </w:r>
+          </w:p>
+        </w:tc>
+        <w:tc>
+          <w:tcPr>
+            <w:tcW w:type="dxa" w:w="6260"/>
+            <w:tcBorders>
+              <w:top w:val="single" w:color="A6A6A6" w:sz="4"/>
+              <w:left w:val="single" w:color="A6A6A6" w:sz="4"/>
+              <w:bottom w:val="single" w:color="A6A6A6" w:sz="4"/>
+              <w:right w:val="single" w:color="A6A6A6" w:sz="4"/>
+            </w:tcBorders>
+            <w:tcMar>
+              <w:top w:type="dxa" w:w="50"/>
+              <w:left w:type="dxa" w:w="90"/>
+              <w:bottom w:type="dxa" w:w="50"/>
+              <w:right w:type="dxa" w:w="90"/>
+            </w:tcMar>
+          </w:tcPr>
+          <w:p>
+            <w:r>
+              <w:rPr>
+                <w:rFonts w:ascii="Calibri" w:cs="Calibri" w:eastAsia="Calibri" w:hAnsi="Calibri"/>
+                <w:sz w:val="19"/>
+                <w:szCs w:val="19"/>
+              </w:rPr>
+              <w:t xml:space="preserve">Earlier stand-alone projects that proved the SDRAM controller and the video modes on the hardware</w:t>
+            </w:r>
+          </w:p>
+        </w:tc>
+      </w:tr>
+      <w:tr>
+        <w:tc>
+          <w:tcPr>
+            <w:tcW w:type="dxa" w:w="3100"/>
+            <w:tcBorders>
+              <w:top w:val="single" w:color="A6A6A6" w:sz="4"/>
+              <w:left w:val="single" w:color="A6A6A6" w:sz="4"/>
+              <w:bottom w:val="single" w:color="A6A6A6" w:sz="4"/>
+              <w:right w:val="single" w:color="A6A6A6" w:sz="4"/>
+            </w:tcBorders>
+            <w:tcMar>
+              <w:top w:type="dxa" w:w="50"/>
+              <w:left w:type="dxa" w:w="90"/>
+              <w:bottom w:type="dxa" w:w="50"/>
+              <w:right w:type="dxa" w:w="90"/>
+            </w:tcMar>
+          </w:tcPr>
+          <w:p>
+            <w:r>
+              <w:rPr>
+                <w:rFonts w:ascii="Calibri" w:cs="Calibri" w:eastAsia="Calibri" w:hAnsi="Calibri"/>
+                <w:sz w:val="19"/>
+                <w:szCs w:val="19"/>
+              </w:rPr>
               <w:t xml:space="preserve">Hardware</w:t>
             </w:r>
           </w:p>
@@ -8706,14 +9109,14 @@
         <w:pStyle w:val="Heading1"/>
         <w:spacing w:after="120" w:before="320"/>
       </w:pPr>
-      <w:bookmarkStart w:name="_Toc24" w:id="24"/>
+      <w:bookmarkStart w:name="_Toc25" w:id="25"/>
       <w:r>
         <w:rPr>
           <w:rFonts w:ascii="Calibri" w:cs="Calibri" w:eastAsia="Calibri" w:hAnsi="Calibri"/>
         </w:rPr>
         <w:t xml:space="preserve">13. Known limitations</w:t>
       </w:r>
-      <w:bookmarkEnd w:id="24"/>
+      <w:bookmarkEnd w:id="25"/>
     </w:p>
     <w:p>
       <w:pPr>
@@ -8730,7 +9133,7 @@
           <w:sz w:val="21"/>
           <w:szCs w:val="21"/>
         </w:rPr>
-        <w:t xml:space="preserve">No memory contention and no floating bus: timing-critical demos and border effects are not exact (the VGA picture is not locked to the Spectrum frame).</w:t>
+        <w:t xml:space="preserve">Memory contention only at Level 1 (memory and I/O cycles; not the internal T-states some instructions contend), no floating bus: timing-critical demos are not exact. The 50 Hz interrupt position is tuned (Aquaplane) rather than calculated; other border-effect games may need Page Up / Page Down.</w:t>
       </w:r>
     </w:p>
     <w:p>
@@ -8766,7 +9169,7 @@
           <w:sz w:val="21"/>
           <w:szCs w:val="21"/>
         </w:rPr>
-        <w:t xml:space="preserve">Tape loader: TZX generalized data (0x19), CSW (0x18) and the select-block menu (0x28) are not played; text and message blocks are not shown; LOAD "" is not typed automatically; at most 400 entries per folder; exFAT cards are not supported.</w:t>
+        <w:t xml:space="preserve">Tape loader: TZX generalized data (0x19), CSW (0x18) and the select-block menu (0x28) are not played; text and message blocks are not shown; LOAD "" is not typed automatically; at most 350 entries per folder; exFAT cards are not supported.</w:t>
       </w:r>
     </w:p>
     <w:p>
@@ -8784,7 +9187,7 @@
           <w:sz w:val="21"/>
           <w:szCs w:val="21"/>
         </w:rPr>
-        <w:t xml:space="preserve">Saving: ROM format only, 8.3 names, no overwrite, no file dates.</w:t>
+        <w:t xml:space="preserve">Saving: ROM format only, 8.3 names, no overwrite, no file dates. Snapshots: .z80 only (no .sna), no overwrite, the video frame position is not kept.</w:t>
       </w:r>
     </w:p>
     <w:p>

</xml_diff>

<commit_message>
Added some more real ZX128 ULA cases
</commit_message>
<xml_diff>
--- a/docs/ASpectrum_Architecture.docx
+++ b/docs/ASpectrum_Architecture.docx
@@ -1222,7 +1222,7 @@
                 <w:sz w:val="19"/>
                 <w:szCs w:val="19"/>
               </w:rPr>
-              <w:t xml:space="preserve">9,233 logic elements (60 %), 55 of 56 M9K, 2 PLLs, 71 pins</w:t>
+              <w:t xml:space="preserve">9,274 logic elements (60 %), 55 of 56 M9K, 2 PLLs, 71 pins</w:t>
             </w:r>
           </w:p>
         </w:tc>
@@ -1278,7 +1278,7 @@
                 <w:sz w:val="19"/>
                 <w:szCs w:val="19"/>
               </w:rPr>
-              <w:t xml:space="preserve">worst setup slack +0.52 ns (112 MHz, slow 85 °C corner), worst hold +0.15 ns, no negative slack at any corner, no unconstrained paths</w:t>
+              <w:t xml:space="preserve">worst setup slack +0.65 ns (112 MHz, slow 85 °C corner), worst hold +0.11 ns, no negative slack at any corner, no unconstrained paths</w:t>
             </w:r>
           </w:p>
         </w:tc>
@@ -3417,7 +3417,35 @@
           <w:sz w:val="21"/>
           <w:szCs w:val="21"/>
         </w:rPr>
-        <w:t xml:space="preserve"> a frame T-state counter restarts at each interrupt and counts real T-states. At the start of each memory cycle to 4000-7FFF (or to C000-FFFF while an odd RAM page is paged in), and in the I/O patterns of the 128K, the CEN is withheld by 6, 5, 4, 3, 2, 1, 0, 0 T-states during the 128 contended T-states of each of the 192 picture lines (from T-state 14,361). Those T-states are lost, as on the real machine, and the tape player counts them too. Off in turbo; F5 switches it off. Not emulated: the internal contended T-states of some instructions, the floating bus.</w:t>
+        <w:t xml:space="preserve"> a frame T-state counter restarts at each interrupt and counts real T-states. At the start of each memory cycle to 4000-7FFF (or to C000-FFFF while an odd RAM page is paged in), and in the I/O patterns of the 128K, the CEN is withheld by 6, 5, 4, 3, 2, 1, 0, 0 T-states during the 128 contended T-states of each of the 192 picture lines (from T-state 14,361). Those T-states are lost, as on the real machine, and the tape player counts them too. Off in turbo; F5 switches it off. Not emulated: the internal contended T-states of some instructions.</w:t>
+      </w:r>
+    </w:p>
+    <w:p>
+      <w:pPr>
+        <w:pStyle w:val="ListParagraph"/>
+        <w:numPr>
+          <w:ilvl w:val="0"/>
+          <w:numId w:val="2"/>
+        </w:numPr>
+        <w:spacing w:after="50"/>
+      </w:pPr>
+      <w:r>
+        <w:rPr>
+          <w:rFonts w:ascii="Calibri" w:cs="Calibri" w:eastAsia="Calibri" w:hAnsi="Calibri"/>
+          <w:b/>
+          <w:bCs/>
+          <w:sz w:val="21"/>
+          <w:szCs w:val="21"/>
+        </w:rPr>
+        <w:t xml:space="preserve">Floating bus:</w:t>
+      </w:r>
+      <w:r>
+        <w:rPr>
+          <w:rFonts w:ascii="Calibri" w:cs="Calibri" w:eastAsia="Calibri" w:hAnsi="Calibri"/>
+          <w:sz w:val="21"/>
+          <w:szCs w:val="21"/>
+        </w:rPr>
+        <w:t xml:space="preserve"> an I/O read of a port nothing answers (e.g. port FF) returns the byte the ULA is fetching at that moment, as on a real 128K: bitmap and attribute bytes of the displayed screen at T-states 2-5 of each 8 within the 128 picture T-states of a line, FF elsewhere. The byte is read from SDRAM during the I/O cycle. On together with contention (F5), off in turbo. Not emulated: ULA snow (DiagROM's snow test fails).</w:t>
       </w:r>
     </w:p>
     <w:p>
@@ -8959,7 +8987,7 @@
                 <w:sz w:val="19"/>
                 <w:szCs w:val="19"/>
               </w:rPr>
-              <w:t xml:space="preserve">sim/run_snapsys_sim.sh</w:t>
+              <w:t xml:space="preserve">sim/run_float_sim.sh</w:t>
             </w:r>
           </w:p>
         </w:tc>
@@ -8986,7 +9014,7 @@
                 <w:sz w:val="19"/>
                 <w:szCs w:val="19"/>
               </w:rPr>
-              <w:t xml:space="preserve">Whole machine with the firmware: F2, a typed name, the snapshot written to the SD card model, F12 + Enter loads it back; loaded state equals the saved state; the file is checked by the independent decoder</w:t>
+              <w:t xml:space="preserve">zx_bus + T80 + SDRAM: 6,000 IN A,(FF) against a reference of the 128K floating bus (incl. contended port addresses); all FF with it switched off</w:t>
             </w:r>
           </w:p>
         </w:tc>
@@ -9015,7 +9043,7 @@
                 <w:sz w:val="19"/>
                 <w:szCs w:val="19"/>
               </w:rPr>
-              <w:t xml:space="preserve">DDR_TEST, VGA_TEST</w:t>
+              <w:t xml:space="preserve">sim/run_snapsys_sim.sh</w:t>
             </w:r>
           </w:p>
         </w:tc>
@@ -9042,7 +9070,7 @@
                 <w:sz w:val="19"/>
                 <w:szCs w:val="19"/>
               </w:rPr>
-              <w:t xml:space="preserve">Earlier stand-alone projects that proved the SDRAM controller and the video modes on the hardware</w:t>
+              <w:t xml:space="preserve">Whole machine with the firmware: F2, a typed name, the snapshot written to the SD card model, F12 + Enter loads it back; loaded state equals the saved state; the file is checked by the independent decoder</w:t>
             </w:r>
           </w:p>
         </w:tc>
@@ -9071,6 +9099,62 @@
                 <w:sz w:val="19"/>
                 <w:szCs w:val="19"/>
               </w:rPr>
+              <w:t xml:space="preserve">DDR_TEST, VGA_TEST</w:t>
+            </w:r>
+          </w:p>
+        </w:tc>
+        <w:tc>
+          <w:tcPr>
+            <w:tcW w:type="dxa" w:w="6260"/>
+            <w:tcBorders>
+              <w:top w:val="single" w:color="A6A6A6" w:sz="4"/>
+              <w:left w:val="single" w:color="A6A6A6" w:sz="4"/>
+              <w:bottom w:val="single" w:color="A6A6A6" w:sz="4"/>
+              <w:right w:val="single" w:color="A6A6A6" w:sz="4"/>
+            </w:tcBorders>
+            <w:tcMar>
+              <w:top w:type="dxa" w:w="50"/>
+              <w:left w:type="dxa" w:w="90"/>
+              <w:bottom w:type="dxa" w:w="50"/>
+              <w:right w:type="dxa" w:w="90"/>
+            </w:tcMar>
+          </w:tcPr>
+          <w:p>
+            <w:r>
+              <w:rPr>
+                <w:rFonts w:ascii="Calibri" w:cs="Calibri" w:eastAsia="Calibri" w:hAnsi="Calibri"/>
+                <w:sz w:val="19"/>
+                <w:szCs w:val="19"/>
+              </w:rPr>
+              <w:t xml:space="preserve">Earlier stand-alone projects that proved the SDRAM controller and the video modes on the hardware</w:t>
+            </w:r>
+          </w:p>
+        </w:tc>
+      </w:tr>
+      <w:tr>
+        <w:tc>
+          <w:tcPr>
+            <w:tcW w:type="dxa" w:w="3100"/>
+            <w:tcBorders>
+              <w:top w:val="single" w:color="A6A6A6" w:sz="4"/>
+              <w:left w:val="single" w:color="A6A6A6" w:sz="4"/>
+              <w:bottom w:val="single" w:color="A6A6A6" w:sz="4"/>
+              <w:right w:val="single" w:color="A6A6A6" w:sz="4"/>
+            </w:tcBorders>
+            <w:tcMar>
+              <w:top w:type="dxa" w:w="50"/>
+              <w:left w:type="dxa" w:w="90"/>
+              <w:bottom w:type="dxa" w:w="50"/>
+              <w:right w:type="dxa" w:w="90"/>
+            </w:tcMar>
+          </w:tcPr>
+          <w:p>
+            <w:r>
+              <w:rPr>
+                <w:rFonts w:ascii="Calibri" w:cs="Calibri" w:eastAsia="Calibri" w:hAnsi="Calibri"/>
+                <w:sz w:val="19"/>
+                <w:szCs w:val="19"/>
+              </w:rPr>
               <w:t xml:space="preserve">Hardware</w:t>
             </w:r>
           </w:p>
@@ -9098,7 +9182,7 @@
                 <w:sz w:val="19"/>
                 <w:szCs w:val="19"/>
               </w:rPr>
-              <w:t xml:space="preserve">128K boots and runs (6 October); games load from the SD card in turbo and at normal speed, saving to the card works (8 October)</w:t>
+              <w:t xml:space="preserve">128K boots and runs (6 October); games load from the SD card in turbo and at normal speed, saving to the card works (8 October); 60 Hz start, contention and the 50 Hz border alignment confirmed with Aquaplane, floating bus confirmed with Sidewize (9 October)</w:t>
             </w:r>
           </w:p>
         </w:tc>
@@ -9133,7 +9217,7 @@
           <w:sz w:val="21"/>
           <w:szCs w:val="21"/>
         </w:rPr>
-        <w:t xml:space="preserve">Memory contention only at Level 1 (memory and I/O cycles; not the internal T-states some instructions contend), no floating bus: timing-critical demos are not exact. The 50 Hz interrupt position is tuned (Aquaplane) rather than calculated; other border-effect games may need Page Up / Page Down.</w:t>
+        <w:t xml:space="preserve">Memory contention only at Level 1 (memory and I/O cycles; not the internal T-states some instructions contend); no ULA snow: timing-critical demos are not exact. The 50 Hz interrupt position is tuned (Aquaplane) rather than calculated; other border-effect games may need Page Up / Page Down.</w:t>
       </w:r>
     </w:p>
     <w:p>

</xml_diff>

<commit_message>
Update to make floating bus work
</commit_message>
<xml_diff>
--- a/docs/ASpectrum_Architecture.docx
+++ b/docs/ASpectrum_Architecture.docx
@@ -3445,7 +3445,7 @@
           <w:sz w:val="21"/>
           <w:szCs w:val="21"/>
         </w:rPr>
-        <w:t xml:space="preserve"> an I/O read of a port nothing answers (e.g. port FF) returns the byte the ULA is fetching at that moment, as on a real 128K: bitmap and attribute bytes of the displayed screen at T-states 2-5 of each 8 within the 128 picture T-states of a line, FF elsewhere. The byte is read from SDRAM during the I/O cycle. On together with contention (F5), off in turbo. Not emulated: ULA snow (DiagROM's snow test fails).</w:t>
+        <w:t xml:space="preserve"> an I/O read of a port nothing answers (e.g. port FF) returns the byte the ULA is fetching when the CPU reads the port, as on a real 128K. The read point follows Fuse 1.6: the start of the I/O cycle's 4th T-state, after all of its contention. Counting x = T-state - 14,362 - 228 x row, the bitmap and attribute bytes of the displayed screen appear at x = 2-5 of each 8 within the 128 picture T-states of a line, FF elsewhere. A contended poll (port high byte 40-7F) therefore only ever sees an attribute or FF, which games that sync on an attribute rely on (Sidewize). The bridge decides at the start of T2: it takes hpos and adds the contention the cycle is still going to get (two pipeline stages), then reads the byte from SDRAM before the CPU takes it at the end of the wait state. (Until 11 October the byte was taken at T2; half of Sidewize's polls then saw pixel bytes, the game synced too early and its player flickered.) On together with contention (F5), off in turbo. Not emulated: ULA snow (DiagROM's snow test fails).</w:t>
       </w:r>
     </w:p>
     <w:p>
@@ -5986,7 +5986,7 @@
                 <w:sz w:val="19"/>
                 <w:szCs w:val="19"/>
               </w:rPr>
-              <w:t xml:space="preserve">0xFF (floating bus is not emulated)</w:t>
+              <w:t xml:space="preserve">floating bus: the screen byte the ULA is fetching (section 4), FF in the border, in turbo or with F5 off</w:t>
             </w:r>
           </w:p>
         </w:tc>
@@ -9014,7 +9014,7 @@
                 <w:sz w:val="19"/>
                 <w:szCs w:val="19"/>
               </w:rPr>
-              <w:t xml:space="preserve">zx_bus + T80 + SDRAM: 6,000 IN A,(FF) against a reference of the 128K floating bus (incl. contended port addresses); all FF with it switched off</w:t>
+              <w:t xml:space="preserve">zx_bus + T80 + SDRAM: 6,000 IN A,(FF) against Fuse 1.6's rule for the 128K floating bus (read point after all I/O contention; incl. contended port addresses); all FF with it switched off</w:t>
             </w:r>
           </w:p>
         </w:tc>
@@ -9043,7 +9043,7 @@
                 <w:sz w:val="19"/>
                 <w:szCs w:val="19"/>
               </w:rPr>
-              <w:t xml:space="preserve">sim/run_snapsys_sim.sh</w:t>
+              <w:t xml:space="preserve">sim/run_floatgame_sim.sh</w:t>
             </w:r>
           </w:p>
         </w:tc>
@@ -9070,7 +9070,7 @@
                 <w:sz w:val="19"/>
                 <w:szCs w:val="19"/>
               </w:rPr>
-              <w:t xml:space="preserve">Whole machine with the firmware: F2, a typed name, the snapshot written to the SD card model, F12 + Enter loads it back; loaded state equals the saved state; the file is checked by the independent decoder</w:t>
+              <w:t xml:space="preserve">zx_bus + T80 + SDRAM running a real game from a .z80 (default Sidewize): every floating-bus read and every exit of the game's sync loop compared with Fuse's rule (~1 minute per frame)</w:t>
             </w:r>
           </w:p>
         </w:tc>
@@ -9099,7 +9099,7 @@
                 <w:sz w:val="19"/>
                 <w:szCs w:val="19"/>
               </w:rPr>
-              <w:t xml:space="preserve">DDR_TEST, VGA_TEST</w:t>
+              <w:t xml:space="preserve">sim/run_snapsys_sim.sh</w:t>
             </w:r>
           </w:p>
         </w:tc>
@@ -9126,7 +9126,7 @@
                 <w:sz w:val="19"/>
                 <w:szCs w:val="19"/>
               </w:rPr>
-              <w:t xml:space="preserve">Earlier stand-alone projects that proved the SDRAM controller and the video modes on the hardware</w:t>
+              <w:t xml:space="preserve">Whole machine with the firmware: F2, a typed name, the snapshot written to the SD card model, F12 + Enter loads it back; loaded state equals the saved state; the file is checked by the independent decoder</w:t>
             </w:r>
           </w:p>
         </w:tc>
@@ -9155,6 +9155,62 @@
                 <w:sz w:val="19"/>
                 <w:szCs w:val="19"/>
               </w:rPr>
+              <w:t xml:space="preserve">DDR_TEST, VGA_TEST</w:t>
+            </w:r>
+          </w:p>
+        </w:tc>
+        <w:tc>
+          <w:tcPr>
+            <w:tcW w:type="dxa" w:w="6260"/>
+            <w:tcBorders>
+              <w:top w:val="single" w:color="A6A6A6" w:sz="4"/>
+              <w:left w:val="single" w:color="A6A6A6" w:sz="4"/>
+              <w:bottom w:val="single" w:color="A6A6A6" w:sz="4"/>
+              <w:right w:val="single" w:color="A6A6A6" w:sz="4"/>
+            </w:tcBorders>
+            <w:tcMar>
+              <w:top w:type="dxa" w:w="50"/>
+              <w:left w:type="dxa" w:w="90"/>
+              <w:bottom w:type="dxa" w:w="50"/>
+              <w:right w:type="dxa" w:w="90"/>
+            </w:tcMar>
+          </w:tcPr>
+          <w:p>
+            <w:r>
+              <w:rPr>
+                <w:rFonts w:ascii="Calibri" w:cs="Calibri" w:eastAsia="Calibri" w:hAnsi="Calibri"/>
+                <w:sz w:val="19"/>
+                <w:szCs w:val="19"/>
+              </w:rPr>
+              <w:t xml:space="preserve">Earlier stand-alone projects that proved the SDRAM controller and the video modes on the hardware</w:t>
+            </w:r>
+          </w:p>
+        </w:tc>
+      </w:tr>
+      <w:tr>
+        <w:tc>
+          <w:tcPr>
+            <w:tcW w:type="dxa" w:w="3100"/>
+            <w:tcBorders>
+              <w:top w:val="single" w:color="A6A6A6" w:sz="4"/>
+              <w:left w:val="single" w:color="A6A6A6" w:sz="4"/>
+              <w:bottom w:val="single" w:color="A6A6A6" w:sz="4"/>
+              <w:right w:val="single" w:color="A6A6A6" w:sz="4"/>
+            </w:tcBorders>
+            <w:tcMar>
+              <w:top w:type="dxa" w:w="50"/>
+              <w:left w:type="dxa" w:w="90"/>
+              <w:bottom w:type="dxa" w:w="50"/>
+              <w:right w:type="dxa" w:w="90"/>
+            </w:tcMar>
+          </w:tcPr>
+          <w:p>
+            <w:r>
+              <w:rPr>
+                <w:rFonts w:ascii="Calibri" w:cs="Calibri" w:eastAsia="Calibri" w:hAnsi="Calibri"/>
+                <w:sz w:val="19"/>
+                <w:szCs w:val="19"/>
+              </w:rPr>
               <w:t xml:space="preserve">Hardware</w:t>
             </w:r>
           </w:p>
@@ -9182,7 +9238,7 @@
                 <w:sz w:val="19"/>
                 <w:szCs w:val="19"/>
               </w:rPr>
-              <w:t xml:space="preserve">128K boots and runs (6 October); games load from the SD card in turbo and at normal speed, saving to the card works (8 October); 60 Hz start, contention and the 50 Hz border alignment confirmed with Aquaplane, floating bus confirmed with Sidewize, snapshots save and load (9 October)</w:t>
+              <w:t xml:space="preserve">128K boots and runs (6 October); games load from the SD card in turbo and at normal speed, saving to the card works (8 October); 60 Hz start, contention and the 50 Hz border alignment confirmed with Aquaplane, floating bus confirmed with Sidewize, snapshots save and load (9 October); floating bus read point corrected, Sidewize's player no longer flickers, Arkanoid and Cobra work (11 October)</w:t>
             </w:r>
           </w:p>
         </w:tc>

</xml_diff>

<commit_message>
Major rework due to resources constarin
</commit_message>
<xml_diff>
--- a/docs/ASpectrum_Architecture.docx
+++ b/docs/ASpectrum_Architecture.docx
@@ -43,7 +43,7 @@
           <w:sz w:val="20"/>
           <w:szCs w:val="20"/>
         </w:rPr>
-        <w:t xml:space="preserve">Design state of 9 October 2026: the 128K machine (on hardware since 6 October), the SD card tape loader with saving, .z80 snapshots and memory contention</w:t>
+        <w:t xml:space="preserve">Design state of 13 October 2026: the 128K machine (on hardware since 6 October), the SD card tape loader with saving, .z80 snapshots, memory contention and Bluetooth audio</w:t>
       </w:r>
     </w:p>
     <w:sdt>
@@ -425,7 +425,7 @@
           </w:pPr>
           <w:hyperlink w:history="1" w:anchor="_Toc17">
             <w:r>
-              <w:t xml:space="preserve">9.1 Hardware (tape_loader.v, 56 MHz)</w:t>
+              <w:t xml:space="preserve">9.1 Hardware (tape_loader.v + esp_link.v, 56 MHz)</w:t>
             </w:r>
             <w:r>
               <w:tab/>
@@ -471,7 +471,7 @@
           </w:pPr>
           <w:hyperlink w:history="1" w:anchor="_Toc19">
             <w:r>
-              <w:t xml:space="preserve">9.3 Firmware (fw/, C)</w:t>
+              <w:t xml:space="preserve">9.3 Firmware (ASpectrum/esp32/src/, C)</w:t>
             </w:r>
             <w:r>
               <w:tab/>
@@ -539,7 +539,7 @@
           </w:pPr>
           <w:hyperlink w:history="1" w:anchor="_Toc22">
             <w:r>
-              <w:t xml:space="preserve">10. Pins</w:t>
+              <w:t xml:space="preserve">10. Bluetooth audio</w:t>
             </w:r>
             <w:r>
               <w:tab/>
@@ -547,6 +547,75 @@
             <w:r>
               <w:fldChar w:fldCharType="begin" w:dirty="true"/>
               <w:instrText xml:space="preserve">PAGEREF _Toc22 \h</w:instrText>
+              <w:fldChar w:fldCharType="separate"/>
+              <w:fldChar w:fldCharType="end"/>
+            </w:r>
+          </w:hyperlink>
+        </w:p>
+        <w:p>
+          <w:pPr>
+            <w:pStyle w:val="TOC2"/>
+            <w:tabs>
+              <w:tab w:val="right" w:pos="9360" w:leader="dot"/>
+            </w:tabs>
+            <w:ind w:left="220"/>
+          </w:pPr>
+          <w:hyperlink w:history="1" w:anchor="_Toc23">
+            <w:r>
+              <w:t xml:space="preserve">10.1 Sound path (bt_i2s.v)</w:t>
+            </w:r>
+            <w:r>
+              <w:tab/>
+            </w:r>
+            <w:r>
+              <w:fldChar w:fldCharType="begin" w:dirty="true"/>
+              <w:instrText xml:space="preserve">PAGEREF _Toc23 \h</w:instrText>
+              <w:fldChar w:fldCharType="separate"/>
+              <w:fldChar w:fldCharType="end"/>
+            </w:r>
+          </w:hyperlink>
+        </w:p>
+        <w:p>
+          <w:pPr>
+            <w:pStyle w:val="TOC2"/>
+            <w:tabs>
+              <w:tab w:val="right" w:pos="9360" w:leader="dot"/>
+            </w:tabs>
+            <w:ind w:left="220"/>
+          </w:pPr>
+          <w:hyperlink w:history="1" w:anchor="_Toc24">
+            <w:r>
+              <w:t xml:space="preserve">10.2 The ESP32 (ASpectrum/esp32/esp32.ino)</w:t>
+            </w:r>
+            <w:r>
+              <w:tab/>
+            </w:r>
+            <w:r>
+              <w:fldChar w:fldCharType="begin" w:dirty="true"/>
+              <w:instrText xml:space="preserve">PAGEREF _Toc24 \h</w:instrText>
+              <w:fldChar w:fldCharType="separate"/>
+              <w:fldChar w:fldCharType="end"/>
+            </w:r>
+          </w:hyperlink>
+        </w:p>
+        <w:p>
+          <w:pPr>
+            <w:pStyle w:val="TOC2"/>
+            <w:tabs>
+              <w:tab w:val="right" w:pos="9360" w:leader="dot"/>
+            </w:tabs>
+            <w:ind w:left="220"/>
+          </w:pPr>
+          <w:hyperlink w:history="1" w:anchor="_Toc25">
+            <w:r>
+              <w:t xml:space="preserve">10.3 Control from ASpectrum (F3)</w:t>
+            </w:r>
+            <w:r>
+              <w:tab/>
+            </w:r>
+            <w:r>
+              <w:fldChar w:fldCharType="begin" w:dirty="true"/>
+              <w:instrText xml:space="preserve">PAGEREF _Toc25 \h</w:instrText>
               <w:fldChar w:fldCharType="separate"/>
               <w:fldChar w:fldCharType="end"/>
             </w:r>
@@ -559,16 +628,16 @@
               <w:tab w:val="right" w:pos="9360" w:leader="dot"/>
             </w:tabs>
           </w:pPr>
-          <w:hyperlink w:history="1" w:anchor="_Toc23">
-            <w:r>
-              <w:t xml:space="preserve">11. Timing constraints</w:t>
+          <w:hyperlink w:history="1" w:anchor="_Toc26">
+            <w:r>
+              <w:t xml:space="preserve">11. Pins</w:t>
             </w:r>
             <w:r>
               <w:tab/>
             </w:r>
             <w:r>
               <w:fldChar w:fldCharType="begin" w:dirty="true"/>
-              <w:instrText xml:space="preserve">PAGEREF _Toc23 \h</w:instrText>
+              <w:instrText xml:space="preserve">PAGEREF _Toc26 \h</w:instrText>
               <w:fldChar w:fldCharType="separate"/>
               <w:fldChar w:fldCharType="end"/>
             </w:r>
@@ -581,16 +650,16 @@
               <w:tab w:val="right" w:pos="9360" w:leader="dot"/>
             </w:tabs>
           </w:pPr>
-          <w:hyperlink w:history="1" w:anchor="_Toc24">
-            <w:r>
-              <w:t xml:space="preserve">12. Verification</w:t>
+          <w:hyperlink w:history="1" w:anchor="_Toc27">
+            <w:r>
+              <w:t xml:space="preserve">12. Timing constraints</w:t>
             </w:r>
             <w:r>
               <w:tab/>
             </w:r>
             <w:r>
               <w:fldChar w:fldCharType="begin" w:dirty="true"/>
-              <w:instrText xml:space="preserve">PAGEREF _Toc24 \h</w:instrText>
+              <w:instrText xml:space="preserve">PAGEREF _Toc27 \h</w:instrText>
               <w:fldChar w:fldCharType="separate"/>
               <w:fldChar w:fldCharType="end"/>
             </w:r>
@@ -603,16 +672,38 @@
               <w:tab w:val="right" w:pos="9360" w:leader="dot"/>
             </w:tabs>
           </w:pPr>
-          <w:hyperlink w:history="1" w:anchor="_Toc25">
-            <w:r>
-              <w:t xml:space="preserve">13. Known limitations</w:t>
+          <w:hyperlink w:history="1" w:anchor="_Toc28">
+            <w:r>
+              <w:t xml:space="preserve">13. Verification</w:t>
             </w:r>
             <w:r>
               <w:tab/>
             </w:r>
             <w:r>
               <w:fldChar w:fldCharType="begin" w:dirty="true"/>
-              <w:instrText xml:space="preserve">PAGEREF _Toc25 \h</w:instrText>
+              <w:instrText xml:space="preserve">PAGEREF _Toc28 \h</w:instrText>
+              <w:fldChar w:fldCharType="separate"/>
+              <w:fldChar w:fldCharType="end"/>
+            </w:r>
+          </w:hyperlink>
+        </w:p>
+        <w:p>
+          <w:pPr>
+            <w:pStyle w:val="TOC1"/>
+            <w:tabs>
+              <w:tab w:val="right" w:pos="9360" w:leader="dot"/>
+            </w:tabs>
+          </w:pPr>
+          <w:hyperlink w:history="1" w:anchor="_Toc29">
+            <w:r>
+              <w:t xml:space="preserve">14. Known limitations</w:t>
+            </w:r>
+            <w:r>
+              <w:tab/>
+            </w:r>
+            <w:r>
+              <w:fldChar w:fldCharType="begin" w:dirty="true"/>
+              <w:instrText xml:space="preserve">PAGEREF _Toc29 \h</w:instrText>
               <w:fldChar w:fldCharType="separate"/>
               <w:fldChar w:fldCharType="end"/>
             </w:r>
@@ -805,7 +896,43 @@
           <w:sz w:val="21"/>
           <w:szCs w:val="21"/>
         </w:rPr>
-        <w:t xml:space="preserve"> (F2 saves the whole machine at any moment, the browser loads them), controlled from on-screen dialogs, and USB-keyboard machine keys (DiagROM, 50/60 Hz, reset).</w:t>
+        <w:t xml:space="preserve"> (F2 saves the whole machine at any moment, the browser loads them), controlled from on-screen dialogs, USB-keyboard machine keys (DiagROM, 50/60 Hz, reset), and </w:t>
+      </w:r>
+      <w:r>
+        <w:rPr>
+          <w:rFonts w:ascii="Calibri" w:cs="Calibri" w:eastAsia="Calibri" w:hAnsi="Calibri"/>
+          <w:b/>
+          <w:bCs/>
+          <w:sz w:val="21"/>
+          <w:szCs w:val="21"/>
+        </w:rPr>
+        <w:t xml:space="preserve">Bluetooth audio</w:t>
+      </w:r>
+      <w:r>
+        <w:rPr>
+          <w:rFonts w:ascii="Calibri" w:cs="Calibri" w:eastAsia="Calibri" w:hAnsi="Calibri"/>
+          <w:sz w:val="21"/>
+          <w:szCs w:val="21"/>
+        </w:rPr>
+        <w:t xml:space="preserve"> to headphones or speakers, chosen in an on-screen menu (F3). An ESP32 board is the </w:t>
+      </w:r>
+      <w:r>
+        <w:rPr>
+          <w:rFonts w:ascii="Calibri" w:cs="Calibri" w:eastAsia="Calibri" w:hAnsi="Calibri"/>
+          <w:b/>
+          <w:bCs/>
+          <w:sz w:val="21"/>
+          <w:szCs w:val="21"/>
+        </w:rPr>
+        <w:t xml:space="preserve">system controller</w:t>
+      </w:r>
+      <w:r>
+        <w:rPr>
+          <w:rFonts w:ascii="Calibri" w:cs="Calibri" w:eastAsia="Calibri" w:hAnsi="Calibri"/>
+          <w:sz w:val="21"/>
+          <w:szCs w:val="21"/>
+        </w:rPr>
+        <w:t xml:space="preserve">: it owns the SD card, runs the loader firmware and the Bluetooth stack, and drives the FPGA's loader hardware over an SPI link.</w:t>
       </w:r>
     </w:p>
     <w:tbl>
@@ -1054,7 +1181,7 @@
                 <w:sz w:val="19"/>
                 <w:szCs w:val="19"/>
               </w:rPr>
-              <w:t xml:space="preserve">User's QM_Atrix adapter: VGA (2 bits per colour), AY + beeper audio to an amplifier module, Kempston DB9, USB keyboard module (UART), tape in, turbo input, 50/60 switch; plus an Adafruit microSD BFF for the tape loader</w:t>
+              <w:t xml:space="preserve">User's QM_Atrix adapter: VGA (2 bits per colour), AY + beeper audio to an amplifier module, Kempston DB9, USB keyboard module (UART), 50/60 switch</w:t>
             </w:r>
           </w:p>
         </w:tc>
@@ -1139,7 +1266,7 @@
                 <w:sz w:val="19"/>
                 <w:szCs w:val="19"/>
               </w:rPr>
-              <w:t xml:space="preserve">Tape loader CPU</w:t>
+              <w:t xml:space="preserve">System controller</w:t>
             </w:r>
           </w:p>
         </w:tc>
@@ -1166,7 +1293,7 @@
                 <w:sz w:val="19"/>
                 <w:szCs w:val="19"/>
               </w:rPr>
-              <w:t xml:space="preserve">PicoRV32 (RISC-V RV32IMC), 56 MHz, 32 KB block RAM, firmware in C</w:t>
+              <w:t xml:space="preserve">ESP32-WROOM-32 DevKit with the Arduino sketch ASpectrum/esp32/: Adafruit microSD BFF on its SPI port, SD tape loader firmware (C), A2DP Bluetooth source fed with the sound over I2S; SPI link (8 MHz) to the FPGA</w:t>
             </w:r>
           </w:p>
         </w:tc>
@@ -1222,7 +1349,7 @@
                 <w:sz w:val="19"/>
                 <w:szCs w:val="19"/>
               </w:rPr>
-              <w:t xml:space="preserve">9,274 logic elements (60 %), 55 of 56 M9K, 2 PLLs, 71 pins</w:t>
+              <w:t xml:space="preserve">7,483 logic elements (49 %), 19 of 56 M9K block RAMs (34 %), 2 PLLs, 75 pins</w:t>
             </w:r>
           </w:p>
         </w:tc>
@@ -1278,7 +1405,7 @@
                 <w:sz w:val="19"/>
                 <w:szCs w:val="19"/>
               </w:rPr>
-              <w:t xml:space="preserve">worst setup slack +0.65 ns (112 MHz, slow 85 °C corner), worst hold +0.11 ns, no negative slack at any corner, no unconstrained paths</w:t>
+              <w:t xml:space="preserve">worst setup slack +0.45 ns (112 MHz, slow 85 °C corner), worst hold +0.15 ns, no negative slack at any corner, no unconstrained paths</w:t>
             </w:r>
           </w:p>
         </w:tc>
@@ -1334,7 +1461,7 @@
                 <w:sz w:val="19"/>
                 <w:szCs w:val="19"/>
               </w:rPr>
-              <w:t xml:space="preserve">Quartus Prime 25.1std Lite, Questa FSE, xPack riscv-none-elf-gcc 15.2</w:t>
+              <w:t xml:space="preserve">Quartus Prime 25.1std Lite, Questa FSE, Arduino core esp32 3.3.2</w:t>
             </w:r>
           </w:p>
         </w:tc>
@@ -2366,23 +2493,106 @@
                 <w:sz w:val="17"/>
                 <w:szCs w:val="17"/>
               </w:rPr>
-              <w:t xml:space="preserve">tape_loader.v</w:t>
-            </w:r>
-            <w:r>
-              <w:rPr>
-                <w:rFonts w:ascii="Calibri" w:cs="Calibri" w:eastAsia="Calibri" w:hAnsi="Calibri"/>
-                <w:sz w:val="19"/>
-                <w:szCs w:val="19"/>
-              </w:rPr>
-              <w:t xml:space="preserve"> + </w:t>
-            </w:r>
+              <w:t xml:space="preserve">bt_i2s.v</w:t>
+            </w:r>
+          </w:p>
+        </w:tc>
+        <w:tc>
+          <w:tcPr>
+            <w:tcW w:type="dxa" w:w="2060"/>
+            <w:tcBorders>
+              <w:top w:val="single" w:color="A6A6A6" w:sz="4"/>
+              <w:left w:val="single" w:color="A6A6A6" w:sz="4"/>
+              <w:bottom w:val="single" w:color="A6A6A6" w:sz="4"/>
+              <w:right w:val="single" w:color="A6A6A6" w:sz="4"/>
+            </w:tcBorders>
+            <w:tcMar>
+              <w:top w:type="dxa" w:w="50"/>
+              <w:left w:type="dxa" w:w="90"/>
+              <w:bottom w:type="dxa" w:w="50"/>
+              <w:right w:type="dxa" w:w="90"/>
+            </w:tcMar>
+          </w:tcPr>
+          <w:p>
+            <w:r>
+              <w:rPr>
+                <w:rFonts w:ascii="Calibri" w:cs="Calibri" w:eastAsia="Calibri" w:hAnsi="Calibri"/>
+                <w:sz w:val="19"/>
+                <w:szCs w:val="19"/>
+              </w:rPr>
+              <w:t xml:space="preserve">112 MHz</w:t>
+            </w:r>
+          </w:p>
+        </w:tc>
+        <w:tc>
+          <w:tcPr>
+            <w:tcW w:type="dxa" w:w="5000"/>
+            <w:tcBorders>
+              <w:top w:val="single" w:color="A6A6A6" w:sz="4"/>
+              <w:left w:val="single" w:color="A6A6A6" w:sz="4"/>
+              <w:bottom w:val="single" w:color="A6A6A6" w:sz="4"/>
+              <w:right w:val="single" w:color="A6A6A6" w:sz="4"/>
+            </w:tcBorders>
+            <w:tcMar>
+              <w:top w:type="dxa" w:w="50"/>
+              <w:left w:type="dxa" w:w="90"/>
+              <w:bottom w:type="dxa" w:w="50"/>
+              <w:right w:type="dxa" w:w="90"/>
+            </w:tcMar>
+          </w:tcPr>
+          <w:p>
+            <w:r>
+              <w:rPr>
+                <w:rFonts w:ascii="Calibri" w:cs="Calibri" w:eastAsia="Calibri" w:hAnsi="Calibri"/>
+                <w:sz w:val="19"/>
+                <w:szCs w:val="19"/>
+              </w:rPr>
+              <w:t xml:space="preserve">The sound as I2S for the ESP32's Bluetooth part</w:t>
+            </w:r>
+          </w:p>
+        </w:tc>
+      </w:tr>
+      <w:tr>
+        <w:tc>
+          <w:tcPr>
+            <w:tcW w:type="dxa" w:w="2300"/>
+            <w:tcBorders>
+              <w:top w:val="single" w:color="A6A6A6" w:sz="4"/>
+              <w:left w:val="single" w:color="A6A6A6" w:sz="4"/>
+              <w:bottom w:val="single" w:color="A6A6A6" w:sz="4"/>
+              <w:right w:val="single" w:color="A6A6A6" w:sz="4"/>
+            </w:tcBorders>
+            <w:tcMar>
+              <w:top w:type="dxa" w:w="50"/>
+              <w:left w:type="dxa" w:w="90"/>
+              <w:bottom w:type="dxa" w:w="50"/>
+              <w:right w:type="dxa" w:w="90"/>
+            </w:tcMar>
+          </w:tcPr>
+          <w:p>
             <w:r>
               <w:rPr>
                 <w:rFonts w:ascii="Consolas" w:cs="Consolas" w:eastAsia="Consolas" w:hAnsi="Consolas"/>
                 <w:sz w:val="17"/>
                 <w:szCs w:val="17"/>
               </w:rPr>
-              <w:t xml:space="preserve">picorv32/</w:t>
+              <w:t xml:space="preserve">tape_loader.v</w:t>
+            </w:r>
+            <w:r>
+              <w:rPr>
+                <w:rFonts w:ascii="Calibri" w:cs="Calibri" w:eastAsia="Calibri" w:hAnsi="Calibri"/>
+                <w:sz w:val="19"/>
+                <w:szCs w:val="19"/>
+              </w:rPr>
+              <w:t xml:space="preserve"> + </w:t>
+            </w:r>
+            <w:r>
+              <w:rPr>
+                <w:rFonts w:ascii="Consolas" w:cs="Consolas" w:eastAsia="Consolas" w:hAnsi="Consolas"/>
+                <w:sz w:val="17"/>
+                <w:szCs w:val="17"/>
+              </w:rPr>
+              <w:t xml:space="preserve">esp_link.v</w:t>
             </w:r>
           </w:p>
         </w:tc>
@@ -2436,7 +2646,7 @@
                 <w:sz w:val="19"/>
                 <w:szCs w:val="19"/>
               </w:rPr>
-              <w:t xml:space="preserve">SD card tape loader: RISC-V CPU, RAM, SPI, command FIFO, pulse player, recorder (saving), snapshot port</w:t>
+              <w:t xml:space="preserve">Tape loader hardware driven by the ESP32 over the SPI link: registers, command FIFO, pulse player, recorder (saving), snapshot port, OSD port, UART to the ESP32</w:t>
             </w:r>
           </w:p>
         </w:tc>
@@ -3013,7 +3223,7 @@
                 <w:sz w:val="19"/>
                 <w:szCs w:val="19"/>
               </w:rPr>
-              <w:t xml:space="preserve">Tape loader; rising edges aligned with c0, so crossings are ordinary timed paths</w:t>
+              <w:t xml:space="preserve">Tape loader hardware and the ESP32 link; rising edges aligned with c0, so crossings are ordinary timed paths</w:t>
             </w:r>
           </w:p>
         </w:tc>
@@ -3234,7 +3444,7 @@
           <w:sz w:val="21"/>
           <w:szCs w:val="21"/>
         </w:rPr>
-        <w:t xml:space="preserve"> (power-up, KEY0): the RISC-V subsystem. Ctrl+Alt+Del leaves it running.</w:t>
+        <w:t xml:space="preserve"> (power-up, KEY0): the loader hardware; the ESP32 notices the reset and restarts itself. Ctrl+Alt+Del leaves both running.</w:t>
       </w:r>
     </w:p>
     <w:p>
@@ -3325,15 +3535,15 @@
           <w:sz w:val="21"/>
           <w:szCs w:val="21"/>
         </w:rPr>
-        <w:t xml:space="preserve">Turbo sources:</w:t>
-      </w:r>
-      <w:r>
-        <w:rPr>
-          <w:rFonts w:ascii="Calibri" w:cs="Calibri" w:eastAsia="Calibri" w:hAnsi="Calibri"/>
-          <w:sz w:val="21"/>
-          <w:szCs w:val="21"/>
-        </w:rPr>
-        <w:t xml:space="preserve"> the TURBO_N pin (external tape simulator, active low) or the SD tape loader while it plays or saves a block; F6 switches the loader to normal speed.</w:t>
+        <w:t xml:space="preserve">Turbo source:</w:t>
+      </w:r>
+      <w:r>
+        <w:rPr>
+          <w:rFonts w:ascii="Calibri" w:cs="Calibri" w:eastAsia="Calibri" w:hAnsi="Calibri"/>
+          <w:sz w:val="21"/>
+          <w:szCs w:val="21"/>
+        </w:rPr>
+        <w:t xml:space="preserve"> the SD tape loader while it plays or saves a block; F6 switches it to normal speed.</w:t>
       </w:r>
     </w:p>
     <w:p>
@@ -5504,6 +5714,34 @@
     </w:p>
     <w:p>
       <w:pPr>
+        <w:pStyle w:val="ListParagraph"/>
+        <w:numPr>
+          <w:ilvl w:val="0"/>
+          <w:numId w:val="2"/>
+        </w:numPr>
+        <w:spacing w:after="50"/>
+      </w:pPr>
+      <w:r>
+        <w:rPr>
+          <w:rFonts w:ascii="Calibri" w:cs="Calibri" w:eastAsia="Calibri" w:hAnsi="Calibri"/>
+          <w:b/>
+          <w:bCs/>
+          <w:sz w:val="21"/>
+          <w:szCs w:val="21"/>
+        </w:rPr>
+        <w:t xml:space="preserve">Bluetooth:</w:t>
+      </w:r>
+      <w:r>
+        <w:rPr>
+          <w:rFonts w:ascii="Calibri" w:cs="Calibri" w:eastAsia="Calibri" w:hAnsi="Calibri"/>
+          <w:sz w:val="21"/>
+          <w:szCs w:val="21"/>
+        </w:rPr>
+        <w:t xml:space="preserve"> the same two sources, mixed and filtered, as 16-bit I2S for the ESP32 bridge (section 10).</w:t>
+      </w:r>
+    </w:p>
+    <w:p>
+      <w:pPr>
         <w:pStyle w:val="Heading2"/>
         <w:spacing w:after="100" w:before="220"/>
       </w:pPr>
@@ -6017,7 +6255,7 @@
           <w:sz w:val="21"/>
           <w:szCs w:val="21"/>
         </w:rPr>
-        <w:t xml:space="preserve"> comes from, in order of priority: the SD tape loader while it plays; the TAPE_IN pin for 75 ms after each edge on it; otherwise the beeper bit (as on the real machine).</w:t>
+        <w:t xml:space="preserve"> comes from the SD tape loader while it plays, otherwise from the beeper bit (as on the real machine).</w:t>
       </w:r>
     </w:p>
     <w:p>
@@ -6197,7 +6435,7 @@
           <w:sz w:val="21"/>
           <w:szCs w:val="21"/>
         </w:rPr>
-        <w:t xml:space="preserve"> passed to the tape loader CPU as a bit vector: F12 / numpad keys / arrows / Enter / Esc / F2 (snapshot) / F5 (contention) / F6 (speed) / F7 (stop) / F9-F11 / Page Up / Page Down (browser paging, or the 50 Hz interrupt position); plus the raw keyboard report for typing file names.</w:t>
+        <w:t xml:space="preserve"> passed to the loader (read by the ESP32 over the link) as a bit vector: F12 / numpad keys / arrows / Enter / Esc / F2 (snapshot) / F3 (Bluetooth menu) / F5 (contention) / F6 (speed) / F7 (stop) / F9-F11 / Page Up / Page Down (browser paging, or the 50 Hz interrupt position); plus the raw keyboard report for typing file names.</w:t>
       </w:r>
     </w:p>
     <w:p>
@@ -6255,7 +6493,7 @@
           <w:sz w:val="21"/>
           <w:szCs w:val="21"/>
         </w:rPr>
-        <w:t xml:space="preserve">The loader replaces the user's external tape simulator (a small microcontroller playing pre-converted files). It reads unmodified .tap and .tzx files from a FAT16/FAT32 microSD card and feeds them to the Spectrum's EAR input in turbo, and it records the Spectrum's SAVE output into new .tap files on the card.</w:t>
+        <w:t xml:space="preserve">The loader reads unmodified .tap and .tzx files from a FAT16/FAT32 microSD card and feeds them to the Spectrum's EAR input in turbo, and it records the Spectrum's SAVE output into new .tap files on the card. The work is split: the ESP32 does the files and dialogs, the FPGA everything that needs exact timing or direct access to the machine.</w:t>
       </w:r>
     </w:p>
     <w:p>
@@ -6268,7 +6506,7 @@
         <w:rPr>
           <w:rFonts w:ascii="Calibri" w:cs="Calibri" w:eastAsia="Calibri" w:hAnsi="Calibri"/>
         </w:rPr>
-        <w:t xml:space="preserve">9.1 Hardware (tape_loader.v, 56 MHz)</w:t>
+        <w:t xml:space="preserve">9.1 Hardware (tape_loader.v + esp_link.v, 56 MHz)</w:t>
       </w:r>
       <w:bookmarkEnd w:id="17"/>
     </w:p>
@@ -6289,15 +6527,15 @@
           <w:sz w:val="21"/>
           <w:szCs w:val="21"/>
         </w:rPr>
-        <w:t xml:space="preserve">PicoRV32</w:t>
-      </w:r>
-      <w:r>
-        <w:rPr>
-          <w:rFonts w:ascii="Calibri" w:cs="Calibri" w:eastAsia="Calibri" w:hAnsi="Calibri"/>
-          <w:sz w:val="21"/>
-          <w:szCs w:val="21"/>
-        </w:rPr>
-        <w:t xml:space="preserve"> (RISC-V RV32IMC, ISC licence, unmodified source) without interrupts or counters, with compressed instructions and multiply/divide (smaller code); 2,580 logic elements, register file in 2 M9K.</w:t>
+        <w:t xml:space="preserve">SPI link</w:t>
+      </w:r>
+      <w:r>
+        <w:rPr>
+          <w:rFonts w:ascii="Calibri" w:cs="Calibri" w:eastAsia="Calibri" w:hAnsi="Calibri"/>
+          <w:sz w:val="21"/>
+          <w:szCs w:val="21"/>
+        </w:rPr>
+        <w:t xml:space="preserve"> (esp_link.v): the ESP32 is the SPI master (mode 0, up to 8 MHz; SCK oversampled at 56 MHz). Each frame (CS low) is a command byte and its data: register write / read, OSD text, pulse commands, Spectrum memory writes / reads through the snapshot port (bursts, about 900 KB/s), and a status read. The link is the master of the loader's register bus; a core ID register ("ZX", version 1) and an interrupt line (FIFO half empty, key change, recorder event, snapshot port idle) complete it.</w:t>
       </w:r>
     </w:p>
     <w:p>
@@ -6317,15 +6555,15 @@
           <w:sz w:val="21"/>
           <w:szCs w:val="21"/>
         </w:rPr>
-        <w:t xml:space="preserve">32 KB RAM</w:t>
-      </w:r>
-      <w:r>
-        <w:rPr>
-          <w:rFonts w:ascii="Calibri" w:cs="Calibri" w:eastAsia="Calibri" w:hAnsi="Calibri"/>
-          <w:sz w:val="21"/>
-          <w:szCs w:val="21"/>
-        </w:rPr>
-        <w:t xml:space="preserve"> for code, data and stack, built as four 8-bit block RAMs (one per byte lane) and loaded with the firmware as part of the bitstream.</w:t>
+        <w:t xml:space="preserve">UART</w:t>
+      </w:r>
+      <w:r>
+        <w:rPr>
+          <w:rFonts w:ascii="Calibri" w:cs="Calibri" w:eastAsia="Calibri" w:hAnsi="Calibri"/>
+          <w:sz w:val="21"/>
+          <w:szCs w:val="21"/>
+        </w:rPr>
+        <w:t xml:space="preserve"> (115,200 baud, 512-byte receive FIFO) to the ESP32's Bluetooth part (section 10).</w:t>
       </w:r>
     </w:p>
     <w:p>
@@ -6353,7 +6591,7 @@
           <w:sz w:val="21"/>
           <w:szCs w:val="21"/>
         </w:rPr>
-        <w:t xml:space="preserve"> MIC edges timed in T-states; while a save runs, an unread edge holds the Z80, so nothing is lost.</w:t>
+        <w:t xml:space="preserve"> MIC edges timed in T-states; while a save runs, an unread edge holds the Z80, so nothing is lost however slowly the ESP32 answers.</w:t>
       </w:r>
     </w:p>
     <w:p>
@@ -6373,15 +6611,33 @@
           <w:sz w:val="21"/>
           <w:szCs w:val="21"/>
         </w:rPr>
-        <w:t xml:space="preserve">SPI master</w:t>
-      </w:r>
-      <w:r>
-        <w:rPr>
-          <w:rFonts w:ascii="Calibri" w:cs="Calibri" w:eastAsia="Calibri" w:hAnsi="Calibri"/>
-          <w:sz w:val="21"/>
-          <w:szCs w:val="21"/>
-        </w:rPr>
-        <w:t xml:space="preserve"> for the card: 400 kHz while initialising, 14 MHz afterwards.</w:t>
+        <w:t xml:space="preserve">Command FIFO</w:t>
+      </w:r>
+      <w:r>
+        <w:rPr>
+          <w:rFonts w:ascii="Calibri" w:cs="Calibri" w:eastAsia="Calibri" w:hAnsi="Calibri"/>
+          <w:sz w:val="21"/>
+          <w:szCs w:val="21"/>
+        </w:rPr>
+        <w:t xml:space="preserve"> (512 x 32 bit) and the </w:t>
+      </w:r>
+      <w:r>
+        <w:rPr>
+          <w:rFonts w:ascii="Calibri" w:cs="Calibri" w:eastAsia="Calibri" w:hAnsi="Calibri"/>
+          <w:b/>
+          <w:bCs/>
+          <w:sz w:val="21"/>
+          <w:szCs w:val="21"/>
+        </w:rPr>
+        <w:t xml:space="preserve">pulse player</w:t>
+      </w:r>
+      <w:r>
+        <w:rPr>
+          <w:rFonts w:ascii="Calibri" w:cs="Calibri" w:eastAsia="Calibri" w:hAnsi="Calibri"/>
+          <w:sz w:val="21"/>
+          <w:szCs w:val="21"/>
+        </w:rPr>
+        <w:t xml:space="preserve">.</w:t>
       </w:r>
     </w:p>
     <w:p>
@@ -6401,15 +6657,15 @@
           <w:sz w:val="21"/>
           <w:szCs w:val="21"/>
         </w:rPr>
-        <w:t xml:space="preserve">Command FIFO</w:t>
-      </w:r>
-      <w:r>
-        <w:rPr>
-          <w:rFonts w:ascii="Calibri" w:cs="Calibri" w:eastAsia="Calibri" w:hAnsi="Calibri"/>
-          <w:sz w:val="21"/>
-          <w:szCs w:val="21"/>
-        </w:rPr>
-        <w:t xml:space="preserve"> (512 x 32 bit) and the </w:t>
+        <w:t xml:space="preserve">OSD write port</w:t>
+      </w:r>
+      <w:r>
+        <w:rPr>
+          <w:rFonts w:ascii="Calibri" w:cs="Calibri" w:eastAsia="Calibri" w:hAnsi="Calibri"/>
+          <w:sz w:val="21"/>
+          <w:szCs w:val="21"/>
+        </w:rPr>
+        <w:t xml:space="preserve"> into the text RAM of the video block; </w:t>
       </w:r>
       <w:r>
         <w:rPr>
@@ -6419,52 +6675,6 @@
           <w:sz w:val="21"/>
           <w:szCs w:val="21"/>
         </w:rPr>
-        <w:t xml:space="preserve">pulse player</w:t>
-      </w:r>
-      <w:r>
-        <w:rPr>
-          <w:rFonts w:ascii="Calibri" w:cs="Calibri" w:eastAsia="Calibri" w:hAnsi="Calibri"/>
-          <w:sz w:val="21"/>
-          <w:szCs w:val="21"/>
-        </w:rPr>
-        <w:t xml:space="preserve">.</w:t>
-      </w:r>
-    </w:p>
-    <w:p>
-      <w:pPr>
-        <w:pStyle w:val="ListParagraph"/>
-        <w:numPr>
-          <w:ilvl w:val="0"/>
-          <w:numId w:val="2"/>
-        </w:numPr>
-        <w:spacing w:after="50"/>
-      </w:pPr>
-      <w:r>
-        <w:rPr>
-          <w:rFonts w:ascii="Calibri" w:cs="Calibri" w:eastAsia="Calibri" w:hAnsi="Calibri"/>
-          <w:b/>
-          <w:bCs/>
-          <w:sz w:val="21"/>
-          <w:szCs w:val="21"/>
-        </w:rPr>
-        <w:t xml:space="preserve">OSD write port</w:t>
-      </w:r>
-      <w:r>
-        <w:rPr>
-          <w:rFonts w:ascii="Calibri" w:cs="Calibri" w:eastAsia="Calibri" w:hAnsi="Calibri"/>
-          <w:sz w:val="21"/>
-          <w:szCs w:val="21"/>
-        </w:rPr>
-        <w:t xml:space="preserve"> into the text RAM of the video block; </w:t>
-      </w:r>
-      <w:r>
-        <w:rPr>
-          <w:rFonts w:ascii="Calibri" w:cs="Calibri" w:eastAsia="Calibri" w:hAnsi="Calibri"/>
-          <w:b/>
-          <w:bCs/>
-          <w:sz w:val="21"/>
-          <w:szCs w:val="21"/>
-        </w:rPr>
         <w:t xml:space="preserve">timer</w:t>
       </w:r>
       <w:r>
@@ -6500,7 +6710,7 @@
           <w:sz w:val="21"/>
           <w:szCs w:val="21"/>
         </w:rPr>
-        <w:t xml:space="preserve">Every tape block is a sequence of signal edges. The CPU turns the file into commands; the player executes them, counting time in </w:t>
+        <w:t xml:space="preserve">Every tape block is a sequence of signal edges. The ESP32 turns the file into commands; the player executes them, counting time in </w:t>
       </w:r>
       <w:r>
         <w:rPr>
@@ -6900,7 +7110,7 @@
           <w:sz w:val="21"/>
           <w:szCs w:val="21"/>
         </w:rPr>
-        <w:t xml:space="preserve">The next command starts in the same clock as the previous one ends, so there are no gaps; settings are taken in while a pulse runs and take effect exactly at its end, so they never show on the line. If the CPU is late, the delay is credited to the next pulse (up to 255 T-states), so edges stay on time.</w:t>
+        <w:t xml:space="preserve">The next command starts in the same clock as the previous one ends, so there are no gaps; settings are taken in while a pulse runs and take effect exactly at its end, so they never show on the line. If the ESP32 is late, the delay is credited to the next pulse (up to 255 T-states), so edges stay on time.</w:t>
       </w:r>
     </w:p>
     <w:p>
@@ -6913,7 +7123,7 @@
         <w:rPr>
           <w:rFonts w:ascii="Calibri" w:cs="Calibri" w:eastAsia="Calibri" w:hAnsi="Calibri"/>
         </w:rPr>
-        <w:t xml:space="preserve">9.3 Firmware (fw/, C)</w:t>
+        <w:t xml:space="preserve">9.3 Firmware (ASpectrum/esp32/src/, C)</w:t>
       </w:r>
       <w:bookmarkEnd w:id="19"/>
     </w:p>
@@ -6934,15 +7144,15 @@
           <w:sz w:val="21"/>
           <w:szCs w:val="21"/>
         </w:rPr>
-        <w:t xml:space="preserve">SD driver:</w:t>
-      </w:r>
-      <w:r>
-        <w:rPr>
-          <w:rFonts w:ascii="Calibri" w:cs="Calibri" w:eastAsia="Calibri" w:hAnsi="Calibri"/>
-          <w:sz w:val="21"/>
-          <w:szCs w:val="21"/>
-        </w:rPr>
-        <w:t xml:space="preserve"> SPI-mode initialisation and single-block reads for SD, SDHC and SDXC cards.</w:t>
+        <w:t xml:space="preserve">Platform:</w:t>
+      </w:r>
+      <w:r>
+        <w:rPr>
+          <w:rFonts w:ascii="Calibri" w:cs="Calibri" w:eastAsia="Calibri" w:hAnsi="Calibri"/>
+          <w:sz w:val="21"/>
+          <w:szCs w:val="21"/>
+        </w:rPr>
+        <w:t xml:space="preserve"> the FPGA's registers appear as proxy objects whose reads and writes go over the link (hw.h, esp_hw.cpp); pulse commands, OSD text and memory writes are collected into one frame each; SD sectors come from the ESP32's SD card driver. The loader runs as a task next to the Bluetooth stack.</w:t>
       </w:r>
     </w:p>
     <w:p>
@@ -6970,7 +7180,7 @@
           <w:sz w:val="21"/>
           <w:szCs w:val="21"/>
         </w:rPr>
-        <w:t xml:space="preserve"> with or without a partition table, long file names, fragmented files, seeking.</w:t>
+        <w:t xml:space="preserve"> with or without a partition table, long file names, fragmented files, seeking, creating files.</w:t>
       </w:r>
     </w:p>
     <w:p>
@@ -7026,7 +7236,7 @@
           <w:sz w:val="21"/>
           <w:szCs w:val="21"/>
         </w:rPr>
-        <w:t xml:space="preserve"> sorted folder lists (up to 350 entries) on the OSD, keys with auto-repeat, pause, back one block, stop, turbo/normal speed (F6), and "stop the tape" blocks for multi-load games.</w:t>
+        <w:t xml:space="preserve"> sorted folder lists (up to 320 entries) on the OSD, keys with auto-repeat, pause, back one block, stop, turbo/normal speed (F6), and "stop the tape" blocks for multi-load games.</w:t>
       </w:r>
     </w:p>
     <w:p>
@@ -7054,7 +7264,7 @@
           <w:sz w:val="21"/>
           <w:szCs w:val="21"/>
         </w:rPr>
-        <w:t xml:space="preserve"> recording mode, ROM-format decoder (pilot, sync, bits), 8.3 name typed on the USB keyboard, FAT writing (free clusters, both FAT copies, directory entries, growing folders, deleting an empty file), SD block writes.</w:t>
+        <w:t xml:space="preserve"> recording mode, ROM-format decoder (pilot, sync, bits), 8.3 name typed on the USB keyboard, FAT writing (free clusters, both FAT copies, directory entries, growing folders, deleting an empty file).</w:t>
       </w:r>
     </w:p>
     <w:p>
@@ -7087,73 +7297,6 @@
     </w:p>
     <w:p>
       <w:pPr>
-        <w:spacing w:after="110"/>
-      </w:pPr>
-      <w:r>
-        <w:rPr>
-          <w:rFonts w:ascii="Calibri" w:cs="Calibri" w:eastAsia="Calibri" w:hAnsi="Calibri"/>
-          <w:sz w:val="21"/>
-          <w:szCs w:val="21"/>
-        </w:rPr>
-        <w:t xml:space="preserve">The firmware is 15.7 KB of code plus 15.3 KB of data (built with shared prologue/epilogue code, -msave-restore); all variables are cleared at start, because a reset does not reload the RAM image. The browser limit went from 400 to 350 entries to make room for the snapshot code.</w:t>
-      </w:r>
-    </w:p>
-    <w:p>
-      <w:pPr>
-        <w:pStyle w:val="Heading2"/>
-        <w:spacing w:after="100" w:before="220"/>
-      </w:pPr>
-      <w:bookmarkStart w:name="_Toc20" w:id="20"/>
-      <w:r>
-        <w:rPr>
-          <w:rFonts w:ascii="Calibri" w:cs="Calibri" w:eastAsia="Calibri" w:hAnsi="Calibri"/>
-        </w:rPr>
-        <w:t xml:space="preserve">9.4 Saving</w:t>
-      </w:r>
-      <w:bookmarkEnd w:id="20"/>
-    </w:p>
-    <w:p>
-      <w:pPr>
-        <w:spacing w:after="110"/>
-      </w:pPr>
-      <w:r>
-        <w:rPr>
-          <w:rFonts w:ascii="Calibri" w:cs="Calibri" w:eastAsia="Calibri" w:hAnsi="Calibri"/>
-          <w:sz w:val="21"/>
-          <w:szCs w:val="21"/>
-        </w:rPr>
-        <w:t xml:space="preserve">Saving is a recording mode, started from the browser (first line [Save to this folder], then an 8.3 name) and stopped with F12. Meanwhile every ROM-format block the Spectrum saves is decoded from MIC and appended to that one .tap file; a block needs 64 pilot pulses, so MIC clicks for sound are ignored, and turbo is switched on only while a block is being saved. TAP block lengths are written as 0 first and patched when a block ends. Each bit is decided by its first pulse, because the ROM does not always end a block with an edge. An empty recording removes its file.</w:t>
-      </w:r>
-    </w:p>
-    <w:p>
-      <w:pPr>
-        <w:pStyle w:val="Heading2"/>
-        <w:spacing w:after="100" w:before="220"/>
-      </w:pPr>
-      <w:bookmarkStart w:name="_Toc21" w:id="21"/>
-      <w:r>
-        <w:rPr>
-          <w:rFonts w:ascii="Calibri" w:cs="Calibri" w:eastAsia="Calibri" w:hAnsi="Calibri"/>
-        </w:rPr>
-        <w:t xml:space="preserve">9.5 Snapshots</w:t>
-      </w:r>
-      <w:bookmarkEnd w:id="21"/>
-    </w:p>
-    <w:p>
-      <w:pPr>
-        <w:spacing w:after="110"/>
-      </w:pPr>
-      <w:r>
-        <w:rPr>
-          <w:rFonts w:ascii="Calibri" w:cs="Calibri" w:eastAsia="Calibri" w:hAnsi="Calibri"/>
-          <w:sz w:val="21"/>
-          <w:szCs w:val="21"/>
-        </w:rPr>
-        <w:t xml:space="preserve">F2 saves the whole machine as a .z80 file (version 3, 128K): the 8 RAM pages, every CPU register, port 7FFD, border, the AY registers and its register select. Choosing a .z80 file in the browser loads it (versions 1-3; 48K snapshots run in 48K mode with 7FFD = 30h).</w:t>
-      </w:r>
-    </w:p>
-    <w:p>
-      <w:pPr>
         <w:pStyle w:val="ListParagraph"/>
         <w:numPr>
           <w:ilvl w:val="0"/>
@@ -7169,15 +7312,82 @@
           <w:sz w:val="21"/>
           <w:szCs w:val="21"/>
         </w:rPr>
-        <w:t xml:space="preserve">Freeze at an instruction boundary</w:t>
-      </w:r>
-      <w:r>
-        <w:rPr>
-          <w:rFonts w:ascii="Calibri" w:cs="Calibri" w:eastAsia="Calibri" w:hAnsi="Calibri"/>
-          <w:sz w:val="21"/>
-          <w:szCs w:val="21"/>
-        </w:rPr>
-        <w:t xml:space="preserve"> (zx_bus): the CEN stops in T2 of an opcode fetch that is not an interrupt acknowledge and does not follow a CB/ED/DD/FD prefix (tracked from the fetched opcodes). There the T80 has written back the previous instruction (at T1) and not yet taken the opcode or incremented PC and R, so its registers are the state between two instructions. In HALT the PC is already past the HALT: the firmware saves PC - 1.</w:t>
+        <w:t xml:space="preserve">Bluetooth menu</w:t>
+      </w:r>
+      <w:r>
+        <w:rPr>
+          <w:rFonts w:ascii="Calibri" w:cs="Calibri" w:eastAsia="Calibri" w:hAnsi="Calibri"/>
+          <w:sz w:val="21"/>
+          <w:szCs w:val="21"/>
+        </w:rPr>
+        <w:t xml:space="preserve"> (F3): commands to the Bluetooth part and its answers and events over the FPGA's UART (section 10.3).</w:t>
+      </w:r>
+    </w:p>
+    <w:p>
+      <w:pPr>
+        <w:spacing w:after="110"/>
+      </w:pPr>
+      <w:r>
+        <w:rPr>
+          <w:rFonts w:ascii="Calibri" w:cs="Calibri" w:eastAsia="Calibri" w:hAnsi="Calibri"/>
+          <w:sz w:val="21"/>
+          <w:szCs w:val="21"/>
+        </w:rPr>
+        <w:t xml:space="preserve">The same C files are built for the PC tests (section 13).</w:t>
+      </w:r>
+    </w:p>
+    <w:p>
+      <w:pPr>
+        <w:pStyle w:val="Heading2"/>
+        <w:spacing w:after="100" w:before="220"/>
+      </w:pPr>
+      <w:bookmarkStart w:name="_Toc20" w:id="20"/>
+      <w:r>
+        <w:rPr>
+          <w:rFonts w:ascii="Calibri" w:cs="Calibri" w:eastAsia="Calibri" w:hAnsi="Calibri"/>
+        </w:rPr>
+        <w:t xml:space="preserve">9.4 Saving</w:t>
+      </w:r>
+      <w:bookmarkEnd w:id="20"/>
+    </w:p>
+    <w:p>
+      <w:pPr>
+        <w:spacing w:after="110"/>
+      </w:pPr>
+      <w:r>
+        <w:rPr>
+          <w:rFonts w:ascii="Calibri" w:cs="Calibri" w:eastAsia="Calibri" w:hAnsi="Calibri"/>
+          <w:sz w:val="21"/>
+          <w:szCs w:val="21"/>
+        </w:rPr>
+        <w:t xml:space="preserve">Saving is a recording mode, started from the browser (first line [Save to this folder], then an 8.3 name) and stopped with F12. Meanwhile every ROM-format block the Spectrum saves is decoded from MIC and appended to that one .tap file; a block needs 64 pilot pulses, so MIC clicks for sound are ignored, and turbo is switched on only while a block is being saved. TAP block lengths are written as 0 first and patched when a block ends. Each bit is decided by its first pulse, because the ROM does not always end a block with an edge. An empty recording removes its file.</w:t>
+      </w:r>
+    </w:p>
+    <w:p>
+      <w:pPr>
+        <w:pStyle w:val="Heading2"/>
+        <w:spacing w:after="100" w:before="220"/>
+      </w:pPr>
+      <w:bookmarkStart w:name="_Toc21" w:id="21"/>
+      <w:r>
+        <w:rPr>
+          <w:rFonts w:ascii="Calibri" w:cs="Calibri" w:eastAsia="Calibri" w:hAnsi="Calibri"/>
+        </w:rPr>
+        <w:t xml:space="preserve">9.5 Snapshots</w:t>
+      </w:r>
+      <w:bookmarkEnd w:id="21"/>
+    </w:p>
+    <w:p>
+      <w:pPr>
+        <w:spacing w:after="110"/>
+      </w:pPr>
+      <w:r>
+        <w:rPr>
+          <w:rFonts w:ascii="Calibri" w:cs="Calibri" w:eastAsia="Calibri" w:hAnsi="Calibri"/>
+          <w:sz w:val="21"/>
+          <w:szCs w:val="21"/>
+        </w:rPr>
+        <w:t xml:space="preserve">F2 saves the whole machine as a .z80 file (version 3, 128K): the 8 RAM pages, every CPU register, port 7FFD, border, the AY registers and its register select. Choosing a .z80 file in the browser loads it (versions 1-3; 48K snapshots run in 48K mode with 7FFD = 30h).</w:t>
       </w:r>
     </w:p>
     <w:p>
@@ -7197,15 +7407,15 @@
           <w:sz w:val="21"/>
           <w:szCs w:val="21"/>
         </w:rPr>
-        <w:t xml:space="preserve">Registers</w:t>
-      </w:r>
-      <w:r>
-        <w:rPr>
-          <w:rFonts w:ascii="Calibri" w:cs="Calibri" w:eastAsia="Calibri" w:hAnsi="Calibri"/>
-          <w:sz w:val="21"/>
-          <w:szCs w:val="21"/>
-        </w:rPr>
-        <w:t xml:space="preserve"> are read from the T80's REG output; loading resets the T80 alone and loads every register at once through its DIRSet/DIR port (the MiSTer way), then the CPU starts a fresh opcode fetch at the saved PC.</w:t>
+        <w:t xml:space="preserve">Freeze at an instruction boundary</w:t>
+      </w:r>
+      <w:r>
+        <w:rPr>
+          <w:rFonts w:ascii="Calibri" w:cs="Calibri" w:eastAsia="Calibri" w:hAnsi="Calibri"/>
+          <w:sz w:val="21"/>
+          <w:szCs w:val="21"/>
+        </w:rPr>
+        <w:t xml:space="preserve"> (zx_bus): the CEN stops in T2 of an opcode fetch that is not an interrupt acknowledge and does not follow a CB/ED/DD/FD prefix (tracked from the fetched opcodes). There the T80 has written back the previous instruction (at T1) and not yet taken the opcode or incremented PC and R, so its registers are the state between two instructions. In HALT the PC is already past the HALT: the firmware saves PC - 1.</w:t>
       </w:r>
     </w:p>
     <w:p>
@@ -7225,15 +7435,15 @@
           <w:sz w:val="21"/>
           <w:szCs w:val="21"/>
         </w:rPr>
-        <w:t xml:space="preserve">Command port</w:t>
-      </w:r>
-      <w:r>
-        <w:rPr>
-          <w:rFonts w:ascii="Calibri" w:cs="Calibri" w:eastAsia="Calibri" w:hAnsi="Calibri"/>
-          <w:sz w:val="21"/>
-          <w:szCs w:val="21"/>
-        </w:rPr>
-        <w:t xml:space="preserve"> (loader to zx_bus, request toggle + acknowledge): SDRAM byte read / write (writes also update the screen shadows), register word read, register word write + LOAD, AY register read / write / select, ports (7FFD, border), state (HALT, AY select, ports).</w:t>
+        <w:t xml:space="preserve">Registers</w:t>
+      </w:r>
+      <w:r>
+        <w:rPr>
+          <w:rFonts w:ascii="Calibri" w:cs="Calibri" w:eastAsia="Calibri" w:hAnsi="Calibri"/>
+          <w:sz w:val="21"/>
+          <w:szCs w:val="21"/>
+        </w:rPr>
+        <w:t xml:space="preserve"> are read from the T80's REG output; loading resets the T80 alone and loads every register at once through its DIRSet/DIR port (the MiSTer way), then the CPU starts a fresh opcode fetch at the saved PC.</w:t>
       </w:r>
     </w:p>
     <w:p>
@@ -7253,15 +7463,15 @@
           <w:sz w:val="21"/>
           <w:szCs w:val="21"/>
         </w:rPr>
-        <w:t xml:space="preserve">Unfreeze:</w:t>
-      </w:r>
-      <w:r>
-        <w:rPr>
-          <w:rFonts w:ascii="Calibri" w:cs="Calibri" w:eastAsia="Calibri" w:hAnsi="Calibri"/>
-          <w:sz w:val="21"/>
-          <w:szCs w:val="21"/>
-        </w:rPr>
-        <w:t xml:space="preserve"> the opcode read of the stopped M1 is repeated (the loader's SDRAM reads changed the data bus), so the program continues as if nothing happened; T-states stopped too, so a playing tape stays in step.</w:t>
+        <w:t xml:space="preserve">Command port</w:t>
+      </w:r>
+      <w:r>
+        <w:rPr>
+          <w:rFonts w:ascii="Calibri" w:cs="Calibri" w:eastAsia="Calibri" w:hAnsi="Calibri"/>
+          <w:sz w:val="21"/>
+          <w:szCs w:val="21"/>
+        </w:rPr>
+        <w:t xml:space="preserve"> (loader to zx_bus, request toggle + acknowledge): SDRAM byte read / write (writes also update the screen shadows), register word read, register word write + LOAD, AY register read / write / select, ports (7FFD, border), state (HALT, AY select, ports).</w:t>
       </w:r>
     </w:p>
     <w:p>
@@ -7276,6 +7486,34 @@
       <w:r>
         <w:rPr>
           <w:rFonts w:ascii="Calibri" w:cs="Calibri" w:eastAsia="Calibri" w:hAnsi="Calibri"/>
+          <w:b/>
+          <w:bCs/>
+          <w:sz w:val="21"/>
+          <w:szCs w:val="21"/>
+        </w:rPr>
+        <w:t xml:space="preserve">Unfreeze:</w:t>
+      </w:r>
+      <w:r>
+        <w:rPr>
+          <w:rFonts w:ascii="Calibri" w:cs="Calibri" w:eastAsia="Calibri" w:hAnsi="Calibri"/>
+          <w:sz w:val="21"/>
+          <w:szCs w:val="21"/>
+        </w:rPr>
+        <w:t xml:space="preserve"> the opcode read of the stopped M1 is repeated (the loader's SDRAM reads changed the data bus), so the program continues as if nothing happened; T-states stopped too, so a playing tape stays in step.</w:t>
+      </w:r>
+    </w:p>
+    <w:p>
+      <w:pPr>
+        <w:pStyle w:val="ListParagraph"/>
+        <w:numPr>
+          <w:ilvl w:val="0"/>
+          <w:numId w:val="2"/>
+        </w:numPr>
+        <w:spacing w:after="50"/>
+      </w:pPr>
+      <w:r>
+        <w:rPr>
+          <w:rFonts w:ascii="Calibri" w:cs="Calibri" w:eastAsia="Calibri" w:hAnsi="Calibri"/>
           <w:sz w:val="21"/>
           <w:szCs w:val="21"/>
         </w:rPr>
@@ -7292,9 +7530,395 @@
         <w:rPr>
           <w:rFonts w:ascii="Calibri" w:cs="Calibri" w:eastAsia="Calibri" w:hAnsi="Calibri"/>
         </w:rPr>
-        <w:t xml:space="preserve">10. Pins</w:t>
+        <w:t xml:space="preserve">10. Bluetooth audio</w:t>
       </w:r>
       <w:bookmarkEnd w:id="22"/>
+    </w:p>
+    <w:p>
+      <w:pPr>
+        <w:spacing w:after="110"/>
+      </w:pPr>
+      <w:r>
+        <w:rPr>
+          <w:rFonts w:ascii="Calibri" w:cs="Calibri" w:eastAsia="Calibri" w:hAnsi="Calibri"/>
+          <w:sz w:val="21"/>
+          <w:szCs w:val="21"/>
+        </w:rPr>
+        <w:t xml:space="preserve">Classic Bluetooth audio (A2DP) needs a radio and a protocol stack that the FPGA does not have, so a small ESP32 board does it: the original ESP32 (ESP32-WROOM-32), because the newer S2 / S3 / C3 chips only have Bluetooth Low Energy. The ESP32 is wired to U7 (pins in section 11; full wiring in ASpectrum_Connection.docx). It acts like a phone: it finds, pairs with and streams to headphones or a speaker.</w:t>
+      </w:r>
+    </w:p>
+    <w:p>
+      <w:pPr>
+        <w:pStyle w:val="Heading2"/>
+        <w:spacing w:after="100" w:before="220"/>
+      </w:pPr>
+      <w:bookmarkStart w:name="_Toc23" w:id="23"/>
+      <w:r>
+        <w:rPr>
+          <w:rFonts w:ascii="Calibri" w:cs="Calibri" w:eastAsia="Calibri" w:hAnsi="Calibri"/>
+        </w:rPr>
+        <w:t xml:space="preserve">10.1 Sound path (bt_i2s.v)</w:t>
+      </w:r>
+      <w:bookmarkEnd w:id="23"/>
+    </w:p>
+    <w:p>
+      <w:pPr>
+        <w:pStyle w:val="ListParagraph"/>
+        <w:numPr>
+          <w:ilvl w:val="0"/>
+          <w:numId w:val="2"/>
+        </w:numPr>
+        <w:spacing w:after="50"/>
+      </w:pPr>
+      <w:r>
+        <w:rPr>
+          <w:rFonts w:ascii="Calibri" w:cs="Calibri" w:eastAsia="Calibri" w:hAnsi="Calibri"/>
+          <w:b/>
+          <w:bCs/>
+          <w:sz w:val="21"/>
+          <w:szCs w:val="21"/>
+        </w:rPr>
+        <w:t xml:space="preserve">Mix:</w:t>
+      </w:r>
+      <w:r>
+        <w:rPr>
+          <w:rFonts w:ascii="Calibri" w:cs="Calibri" w:eastAsia="Calibri" w:hAnsi="Calibri"/>
+          <w:sz w:val="21"/>
+          <w:szCs w:val="21"/>
+        </w:rPr>
+        <w:t xml:space="preserve"> the AY value (10 bit) x 16 plus 8192 for the beeper, the same sources as the analog outputs.</w:t>
+      </w:r>
+    </w:p>
+    <w:p>
+      <w:pPr>
+        <w:pStyle w:val="ListParagraph"/>
+        <w:numPr>
+          <w:ilvl w:val="0"/>
+          <w:numId w:val="2"/>
+        </w:numPr>
+        <w:spacing w:after="50"/>
+      </w:pPr>
+      <w:r>
+        <w:rPr>
+          <w:rFonts w:ascii="Calibri" w:cs="Calibri" w:eastAsia="Calibri" w:hAnsi="Calibri"/>
+          <w:b/>
+          <w:bCs/>
+          <w:sz w:val="21"/>
+          <w:szCs w:val="21"/>
+        </w:rPr>
+        <w:t xml:space="preserve">Filters:</w:t>
+      </w:r>
+      <w:r>
+        <w:rPr>
+          <w:rFonts w:ascii="Calibri" w:cs="Calibri" w:eastAsia="Calibri" w:hAnsi="Calibri"/>
+          <w:sz w:val="21"/>
+          <w:szCs w:val="21"/>
+        </w:rPr>
+        <w:t xml:space="preserve"> two one-pole low-passes at the AY rate (3.5469 MHz, about 35 kHz each) against aliasing at 44.1 kHz, then a DC blocker once per sample (about 27 Hz), so silence is 0 whatever the AY volumes or the beeper level.</w:t>
+      </w:r>
+    </w:p>
+    <w:p>
+      <w:pPr>
+        <w:pStyle w:val="ListParagraph"/>
+        <w:numPr>
+          <w:ilvl w:val="0"/>
+          <w:numId w:val="2"/>
+        </w:numPr>
+        <w:spacing w:after="50"/>
+      </w:pPr>
+      <w:r>
+        <w:rPr>
+          <w:rFonts w:ascii="Calibri" w:cs="Calibri" w:eastAsia="Calibri" w:hAnsi="Calibri"/>
+          <w:b/>
+          <w:bCs/>
+          <w:sz w:val="21"/>
+          <w:szCs w:val="21"/>
+        </w:rPr>
+        <w:t xml:space="preserve">I2S:</w:t>
+      </w:r>
+      <w:r>
+        <w:rPr>
+          <w:rFonts w:ascii="Calibri" w:cs="Calibri" w:eastAsia="Calibri" w:hAnsi="Calibri"/>
+          <w:sz w:val="21"/>
+          <w:szCs w:val="21"/>
+        </w:rPr>
+        <w:t xml:space="preserve"> the ESP32 is the master and drives BCLK (1.4112 MHz) and LRCK (44.1 kHz), so the Bluetooth stream and the sound share one clock. The FPGA synchronises both and sends 16-bit words, MSB first, one BCLK after each LRCK edge (Philips format), the same sample in both channels; DATA changes about 27 ns after the falling BCLK edge, far ahead of the next rising edge (354 ns).</w:t>
+      </w:r>
+    </w:p>
+    <w:p>
+      <w:pPr>
+        <w:pStyle w:val="Heading2"/>
+        <w:spacing w:after="100" w:before="220"/>
+      </w:pPr>
+      <w:bookmarkStart w:name="_Toc24" w:id="24"/>
+      <w:r>
+        <w:rPr>
+          <w:rFonts w:ascii="Calibri" w:cs="Calibri" w:eastAsia="Calibri" w:hAnsi="Calibri"/>
+        </w:rPr>
+        <w:t xml:space="preserve">10.2 The ESP32 (ASpectrum/esp32/esp32.ino)</w:t>
+      </w:r>
+      <w:bookmarkEnd w:id="24"/>
+    </w:p>
+    <w:p>
+      <w:pPr>
+        <w:pStyle w:val="ListParagraph"/>
+        <w:numPr>
+          <w:ilvl w:val="0"/>
+          <w:numId w:val="2"/>
+        </w:numPr>
+        <w:spacing w:after="50"/>
+      </w:pPr>
+      <w:r>
+        <w:rPr>
+          <w:rFonts w:ascii="Calibri" w:cs="Calibri" w:eastAsia="Calibri" w:hAnsi="Calibri"/>
+          <w:sz w:val="21"/>
+          <w:szCs w:val="21"/>
+        </w:rPr>
+        <w:t xml:space="preserve">Arduino sketch on the ESP32 core 3.3 with the ESP32-A2DP library (v1.8.11): an A2DP source that takes its samples from the I2S input (or a test tone), reconnects to the last device by itself, and stores its settings (device, PIN, volume, source) in flash.</w:t>
+      </w:r>
+    </w:p>
+    <w:p>
+      <w:pPr>
+        <w:pStyle w:val="ListParagraph"/>
+        <w:numPr>
+          <w:ilvl w:val="0"/>
+          <w:numId w:val="2"/>
+        </w:numPr>
+        <w:spacing w:after="50"/>
+      </w:pPr>
+      <w:r>
+        <w:rPr>
+          <w:rFonts w:ascii="Calibri" w:cs="Calibri" w:eastAsia="Calibri" w:hAnsi="Calibri"/>
+          <w:b/>
+          <w:bCs/>
+          <w:sz w:val="21"/>
+          <w:szCs w:val="21"/>
+        </w:rPr>
+        <w:t xml:space="preserve">PIN devices</w:t>
+      </w:r>
+      <w:r>
+        <w:rPr>
+          <w:rFonts w:ascii="Calibri" w:cs="Calibri" w:eastAsia="Calibri" w:hAnsi="Calibri"/>
+          <w:sz w:val="21"/>
+          <w:szCs w:val="21"/>
+        </w:rPr>
+        <w:t xml:space="preserve"> (Bluetooth 2.0 and older) ask for a fixed code: the ESP32 answers with 0000, 1234, 8888 and 1111 in turn, one per connection attempt, or with a code set in the menu. Newer devices pair without a code. Old devices that only give their name on request are listed too.</w:t>
+      </w:r>
+    </w:p>
+    <w:p>
+      <w:pPr>
+        <w:pStyle w:val="ListParagraph"/>
+        <w:numPr>
+          <w:ilvl w:val="0"/>
+          <w:numId w:val="2"/>
+        </w:numPr>
+        <w:spacing w:after="50"/>
+      </w:pPr>
+      <w:r>
+        <w:rPr>
+          <w:rFonts w:ascii="Calibri" w:cs="Calibri" w:eastAsia="Calibri" w:hAnsi="Calibri"/>
+          <w:b/>
+          <w:bCs/>
+          <w:sz w:val="21"/>
+          <w:szCs w:val="21"/>
+        </w:rPr>
+        <w:t xml:space="preserve">ESP-IDF fix:</w:t>
+      </w:r>
+      <w:r>
+        <w:rPr>
+          <w:rFonts w:ascii="Calibri" w:cs="Calibri" w:eastAsia="Calibri" w:hAnsi="Calibri"/>
+          <w:sz w:val="21"/>
+          <w:szCs w:val="21"/>
+        </w:rPr>
+        <w:t xml:space="preserve"> when the headphones open the stream themselves (Bose headphones do), ESP-IDF 5.5 never asks for their codec capabilities, leaves its SBC encoder unset and crashed with a division by zero. The sketch wraps the failing function at link time (-Wl,--wrap) and reports success while a link is open; the encoder then uses the standard SBC setup that the headphones chose.</w:t>
+      </w:r>
+    </w:p>
+    <w:p>
+      <w:pPr>
+        <w:pStyle w:val="Heading2"/>
+        <w:spacing w:after="100" w:before="220"/>
+      </w:pPr>
+      <w:bookmarkStart w:name="_Toc25" w:id="25"/>
+      <w:r>
+        <w:rPr>
+          <w:rFonts w:ascii="Calibri" w:cs="Calibri" w:eastAsia="Calibri" w:hAnsi="Calibri"/>
+        </w:rPr>
+        <w:t xml:space="preserve">10.3 Control from ASpectrum (F3)</w:t>
+      </w:r>
+      <w:bookmarkEnd w:id="25"/>
+    </w:p>
+    <w:p>
+      <w:pPr>
+        <w:spacing w:after="110"/>
+      </w:pPr>
+      <w:r>
+        <w:rPr>
+          <w:rFonts w:ascii="Calibri" w:cs="Calibri" w:eastAsia="Calibri" w:hAnsi="Calibri"/>
+          <w:sz w:val="21"/>
+          <w:szCs w:val="21"/>
+        </w:rPr>
+        <w:t xml:space="preserve">The loader's menu (bt.cpp) and the Bluetooth part talk through the FPGA's UART (115,200 baud, U7.20/21) with text lines: commands (</w:t>
+      </w:r>
+      <w:r>
+        <w:rPr>
+          <w:rFonts w:ascii="Consolas" w:cs="Consolas" w:eastAsia="Consolas" w:hAnsi="Consolas"/>
+          <w:sz w:val="19"/>
+          <w:szCs w:val="19"/>
+        </w:rPr>
+        <w:t xml:space="preserve">info</w:t>
+      </w:r>
+      <w:r>
+        <w:rPr>
+          <w:rFonts w:ascii="Calibri" w:cs="Calibri" w:eastAsia="Calibri" w:hAnsi="Calibri"/>
+          <w:sz w:val="21"/>
+          <w:szCs w:val="21"/>
+        </w:rPr>
+        <w:t xml:space="preserve">, </w:t>
+      </w:r>
+      <w:r>
+        <w:rPr>
+          <w:rFonts w:ascii="Consolas" w:cs="Consolas" w:eastAsia="Consolas" w:hAnsi="Consolas"/>
+          <w:sz w:val="19"/>
+          <w:szCs w:val="19"/>
+        </w:rPr>
+        <w:t xml:space="preserve">scan</w:t>
+      </w:r>
+      <w:r>
+        <w:rPr>
+          <w:rFonts w:ascii="Calibri" w:cs="Calibri" w:eastAsia="Calibri" w:hAnsi="Calibri"/>
+          <w:sz w:val="21"/>
+          <w:szCs w:val="21"/>
+        </w:rPr>
+        <w:t xml:space="preserve">, </w:t>
+      </w:r>
+      <w:r>
+        <w:rPr>
+          <w:rFonts w:ascii="Consolas" w:cs="Consolas" w:eastAsia="Consolas" w:hAnsi="Consolas"/>
+          <w:sz w:val="19"/>
+          <w:szCs w:val="19"/>
+        </w:rPr>
+        <w:t xml:space="preserve">connect n</w:t>
+      </w:r>
+      <w:r>
+        <w:rPr>
+          <w:rFonts w:ascii="Calibri" w:cs="Calibri" w:eastAsia="Calibri" w:hAnsi="Calibri"/>
+          <w:sz w:val="21"/>
+          <w:szCs w:val="21"/>
+        </w:rPr>
+        <w:t xml:space="preserve">, </w:t>
+      </w:r>
+      <w:r>
+        <w:rPr>
+          <w:rFonts w:ascii="Consolas" w:cs="Consolas" w:eastAsia="Consolas" w:hAnsi="Consolas"/>
+          <w:sz w:val="19"/>
+          <w:szCs w:val="19"/>
+        </w:rPr>
+        <w:t xml:space="preserve">disconnect</w:t>
+      </w:r>
+      <w:r>
+        <w:rPr>
+          <w:rFonts w:ascii="Calibri" w:cs="Calibri" w:eastAsia="Calibri" w:hAnsi="Calibri"/>
+          <w:sz w:val="21"/>
+          <w:szCs w:val="21"/>
+        </w:rPr>
+        <w:t xml:space="preserve">, </w:t>
+      </w:r>
+      <w:r>
+        <w:rPr>
+          <w:rFonts w:ascii="Consolas" w:cs="Consolas" w:eastAsia="Consolas" w:hAnsi="Consolas"/>
+          <w:sz w:val="19"/>
+          <w:szCs w:val="19"/>
+        </w:rPr>
+        <w:t xml:space="preserve">forget</w:t>
+      </w:r>
+      <w:r>
+        <w:rPr>
+          <w:rFonts w:ascii="Calibri" w:cs="Calibri" w:eastAsia="Calibri" w:hAnsi="Calibri"/>
+          <w:sz w:val="21"/>
+          <w:szCs w:val="21"/>
+        </w:rPr>
+        <w:t xml:space="preserve">, </w:t>
+      </w:r>
+      <w:r>
+        <w:rPr>
+          <w:rFonts w:ascii="Consolas" w:cs="Consolas" w:eastAsia="Consolas" w:hAnsi="Consolas"/>
+          <w:sz w:val="19"/>
+          <w:szCs w:val="19"/>
+        </w:rPr>
+        <w:t xml:space="preserve">pin</w:t>
+      </w:r>
+      <w:r>
+        <w:rPr>
+          <w:rFonts w:ascii="Calibri" w:cs="Calibri" w:eastAsia="Calibri" w:hAnsi="Calibri"/>
+          <w:sz w:val="21"/>
+          <w:szCs w:val="21"/>
+        </w:rPr>
+        <w:t xml:space="preserve">, </w:t>
+      </w:r>
+      <w:r>
+        <w:rPr>
+          <w:rFonts w:ascii="Consolas" w:cs="Consolas" w:eastAsia="Consolas" w:hAnsi="Consolas"/>
+          <w:sz w:val="19"/>
+          <w:szCs w:val="19"/>
+        </w:rPr>
+        <w:t xml:space="preserve">vol</w:t>
+      </w:r>
+      <w:r>
+        <w:rPr>
+          <w:rFonts w:ascii="Calibri" w:cs="Calibri" w:eastAsia="Calibri" w:hAnsi="Calibri"/>
+          <w:sz w:val="21"/>
+          <w:szCs w:val="21"/>
+        </w:rPr>
+        <w:t xml:space="preserve">, </w:t>
+      </w:r>
+      <w:r>
+        <w:rPr>
+          <w:rFonts w:ascii="Consolas" w:cs="Consolas" w:eastAsia="Consolas" w:hAnsi="Consolas"/>
+          <w:sz w:val="19"/>
+          <w:szCs w:val="19"/>
+        </w:rPr>
+        <w:t xml:space="preserve">src</w:t>
+      </w:r>
+      <w:r>
+        <w:rPr>
+          <w:rFonts w:ascii="Calibri" w:cs="Calibri" w:eastAsia="Calibri" w:hAnsi="Calibri"/>
+          <w:sz w:val="21"/>
+          <w:szCs w:val="21"/>
+        </w:rPr>
+        <w:t xml:space="preserve">), answers starting with OK or ERR, and events starting with EV (device found, connecting, connected, pairing with PIN ..., paired, disconnected). F3 opens a full-screen menu: state, Scan for devices, Disconnect, Forget the device, PIN, Volume, Sound (Spectrum or test tone), and the devices found; Enter on a device connects to it. The menu asks for the state every second and shows events at once; a tape that is playing goes on meanwhile. The ESP32's USB port takes the same commands, for debugging.</w:t>
+      </w:r>
+    </w:p>
+    <w:p>
+      <w:pPr>
+        <w:pStyle w:val="ListParagraph"/>
+        <w:numPr>
+          <w:ilvl w:val="0"/>
+          <w:numId w:val="2"/>
+        </w:numPr>
+        <w:spacing w:after="50"/>
+      </w:pPr>
+      <w:r>
+        <w:rPr>
+          <w:rFonts w:ascii="Calibri" w:cs="Calibri" w:eastAsia="Calibri" w:hAnsi="Calibri"/>
+          <w:sz w:val="21"/>
+          <w:szCs w:val="21"/>
+        </w:rPr>
+        <w:t xml:space="preserve">Bluetooth (SBC) adds roughly 0.15-0.25 s of delay: fine for music, noticeable in fast games.</w:t>
+      </w:r>
+    </w:p>
+    <w:p>
+      <w:pPr>
+        <w:pStyle w:val="Heading1"/>
+        <w:spacing w:after="120" w:before="320"/>
+      </w:pPr>
+      <w:bookmarkStart w:name="_Toc26" w:id="26"/>
+      <w:r>
+        <w:rPr>
+          <w:rFonts w:ascii="Calibri" w:cs="Calibri" w:eastAsia="Calibri" w:hAnsi="Calibri"/>
+        </w:rPr>
+        <w:t xml:space="preserve">11. Pins</w:t>
+      </w:r>
+      <w:bookmarkEnd w:id="26"/>
     </w:p>
     <w:tbl>
       <w:tblPr>
@@ -7933,7 +8557,7 @@
                 <w:sz w:val="19"/>
                 <w:szCs w:val="19"/>
               </w:rPr>
-              <w:t xml:space="preserve">TAPE_IN / TURBO_N</w:t>
+              <w:t xml:space="preserve">KBD_A / KBD_B</w:t>
             </w:r>
           </w:p>
         </w:tc>
@@ -7960,7 +8584,7 @@
                 <w:sz w:val="19"/>
                 <w:szCs w:val="19"/>
               </w:rPr>
-              <w:t xml:space="preserve">Y22 / AA20</w:t>
+              <w:t xml:space="preserve">AA19 / AA18</w:t>
             </w:r>
           </w:p>
         </w:tc>
@@ -7987,7 +8611,7 @@
                 <w:sz w:val="19"/>
                 <w:szCs w:val="19"/>
               </w:rPr>
-              <w:t xml:space="preserve">adapter J2: external tape simulator</w:t>
+              <w:t xml:space="preserve">adapter J2: keyboard module UART (both inputs, data = A AND B)</w:t>
             </w:r>
           </w:p>
         </w:tc>
@@ -8016,7 +8640,7 @@
                 <w:sz w:val="19"/>
                 <w:szCs w:val="19"/>
               </w:rPr>
-              <w:t xml:space="preserve">KBD_A / KBD_B</w:t>
+              <w:t xml:space="preserve">GND_TIE[1:0]</w:t>
             </w:r>
           </w:p>
         </w:tc>
@@ -8043,7 +8667,7 @@
                 <w:sz w:val="19"/>
                 <w:szCs w:val="19"/>
               </w:rPr>
-              <w:t xml:space="preserve">AA19 / AA18</w:t>
+              <w:t xml:space="preserve">AA17 / AB17</w:t>
             </w:r>
           </w:p>
         </w:tc>
@@ -8070,7 +8694,7 @@
                 <w:sz w:val="19"/>
                 <w:szCs w:val="19"/>
               </w:rPr>
-              <w:t xml:space="preserve">adapter J2: keyboard module UART (both inputs, data = A AND B)</w:t>
+              <w:t xml:space="preserve">tied to ground by the adapter: inputs only</w:t>
             </w:r>
           </w:p>
         </w:tc>
@@ -8099,7 +8723,7 @@
                 <w:sz w:val="19"/>
                 <w:szCs w:val="19"/>
               </w:rPr>
-              <w:t xml:space="preserve">GND_TIE[1:0]</w:t>
+              <w:t xml:space="preserve">AUDIO_AY / AUDIO_BEEPER</w:t>
             </w:r>
           </w:p>
         </w:tc>
@@ -8126,7 +8750,7 @@
                 <w:sz w:val="19"/>
                 <w:szCs w:val="19"/>
               </w:rPr>
-              <w:t xml:space="preserve">AA17 / AB17</w:t>
+              <w:t xml:space="preserve">J1 / J2</w:t>
             </w:r>
           </w:p>
         </w:tc>
@@ -8153,7 +8777,7 @@
                 <w:sz w:val="19"/>
                 <w:szCs w:val="19"/>
               </w:rPr>
-              <w:t xml:space="preserve">tied to ground by the adapter: inputs only</w:t>
+              <w:t xml:space="preserve">adapter J1 wired to U7.15 / U7.16</w:t>
             </w:r>
           </w:p>
         </w:tc>
@@ -8182,7 +8806,7 @@
                 <w:sz w:val="19"/>
                 <w:szCs w:val="19"/>
               </w:rPr>
-              <w:t xml:space="preserve">AUDIO_AY / AUDIO_BEEPER</w:t>
+              <w:t xml:space="preserve">JOY_UP/DOWN/LEFT/RIGHT/FIRE_N</w:t>
             </w:r>
           </w:p>
         </w:tc>
@@ -8209,7 +8833,7 @@
                 <w:sz w:val="19"/>
                 <w:szCs w:val="19"/>
               </w:rPr>
-              <w:t xml:space="preserve">J1 / J2</w:t>
+              <w:t xml:space="preserve">C1 C2 B1 B2 B3</w:t>
             </w:r>
           </w:p>
         </w:tc>
@@ -8236,7 +8860,7 @@
                 <w:sz w:val="19"/>
                 <w:szCs w:val="19"/>
               </w:rPr>
-              <w:t xml:space="preserve">adapter J1 wired to U7.15 / U7.16</w:t>
+              <w:t xml:space="preserve">adapter J1 wired to U7.23-27 (pull-ups)</w:t>
             </w:r>
           </w:p>
         </w:tc>
@@ -8265,7 +8889,7 @@
                 <w:sz w:val="19"/>
                 <w:szCs w:val="19"/>
               </w:rPr>
-              <w:t xml:space="preserve">JOY_UP/DOWN/LEFT/RIGHT/FIRE_N</w:t>
+              <w:t xml:space="preserve">ESP_SCK / MOSI / CS_N (in)</w:t>
             </w:r>
           </w:p>
         </w:tc>
@@ -8292,7 +8916,7 @@
                 <w:sz w:val="19"/>
                 <w:szCs w:val="19"/>
               </w:rPr>
-              <w:t xml:space="preserve">C1 C2 B1 B2 B3</w:t>
+              <w:t xml:space="preserve">P1 / P2 / N1</w:t>
             </w:r>
           </w:p>
         </w:tc>
@@ -8319,7 +8943,7 @@
                 <w:sz w:val="19"/>
                 <w:szCs w:val="19"/>
               </w:rPr>
-              <w:t xml:space="preserve">adapter J1 wired to U7.23-27 (pull-ups)</w:t>
+              <w:t xml:space="preserve">ESP32 GPIO14 / 13 / 33 on U7.9 / 10 / 11: SPI link</w:t>
             </w:r>
           </w:p>
         </w:tc>
@@ -8348,7 +8972,7 @@
                 <w:sz w:val="19"/>
                 <w:szCs w:val="19"/>
               </w:rPr>
-              <w:t xml:space="preserve">SD_MOSI / MISO / SCK / CS_N</w:t>
+              <w:t xml:space="preserve">ESP_MISO / ESP_IRQ (out)</w:t>
             </w:r>
           </w:p>
         </w:tc>
@@ -8375,7 +8999,7 @@
                 <w:sz w:val="19"/>
                 <w:szCs w:val="19"/>
               </w:rPr>
-              <w:t xml:space="preserve">AA13 / AA14 / AA15 / AA16</w:t>
+              <w:t xml:space="preserve">R1 / R2</w:t>
             </w:r>
           </w:p>
         </w:tc>
@@ -8402,7 +9026,173 @@
                 <w:sz w:val="19"/>
                 <w:szCs w:val="19"/>
               </w:rPr>
-              <w:t xml:space="preserve">Adafruit microSD BFF on U8.7 / 9 / 11 / 13</w:t>
+              <w:t xml:space="preserve">ESP32 GPIO35 / 34 on U7.7 / 8: SPI link data, interrupt</w:t>
+            </w:r>
+          </w:p>
+        </w:tc>
+      </w:tr>
+      <w:tr>
+        <w:tc>
+          <w:tcPr>
+            <w:tcW w:type="dxa" w:w="2500"/>
+            <w:tcBorders>
+              <w:top w:val="single" w:color="A6A6A6" w:sz="4"/>
+              <w:left w:val="single" w:color="A6A6A6" w:sz="4"/>
+              <w:bottom w:val="single" w:color="A6A6A6" w:sz="4"/>
+              <w:right w:val="single" w:color="A6A6A6" w:sz="4"/>
+            </w:tcBorders>
+            <w:tcMar>
+              <w:top w:type="dxa" w:w="50"/>
+              <w:left w:type="dxa" w:w="90"/>
+              <w:bottom w:type="dxa" w:w="50"/>
+              <w:right w:type="dxa" w:w="90"/>
+            </w:tcMar>
+          </w:tcPr>
+          <w:p>
+            <w:r>
+              <w:rPr>
+                <w:rFonts w:ascii="Calibri" w:cs="Calibri" w:eastAsia="Calibri" w:hAnsi="Calibri"/>
+                <w:sz w:val="19"/>
+                <w:szCs w:val="19"/>
+              </w:rPr>
+              <w:t xml:space="preserve">BT_BCLK / BT_LRCK (in), BT_DATA (out)</w:t>
+            </w:r>
+          </w:p>
+        </w:tc>
+        <w:tc>
+          <w:tcPr>
+            <w:tcW w:type="dxa" w:w="1500"/>
+            <w:tcBorders>
+              <w:top w:val="single" w:color="A6A6A6" w:sz="4"/>
+              <w:left w:val="single" w:color="A6A6A6" w:sz="4"/>
+              <w:bottom w:val="single" w:color="A6A6A6" w:sz="4"/>
+              <w:right w:val="single" w:color="A6A6A6" w:sz="4"/>
+            </w:tcBorders>
+            <w:tcMar>
+              <w:top w:type="dxa" w:w="50"/>
+              <w:left w:type="dxa" w:w="90"/>
+              <w:bottom w:type="dxa" w:w="50"/>
+              <w:right w:type="dxa" w:w="90"/>
+            </w:tcMar>
+          </w:tcPr>
+          <w:p>
+            <w:r>
+              <w:rPr>
+                <w:rFonts w:ascii="Calibri" w:cs="Calibri" w:eastAsia="Calibri" w:hAnsi="Calibri"/>
+                <w:sz w:val="19"/>
+                <w:szCs w:val="19"/>
+              </w:rPr>
+              <w:t xml:space="preserve">H1 / H2 / F1</w:t>
+            </w:r>
+          </w:p>
+        </w:tc>
+        <w:tc>
+          <w:tcPr>
+            <w:tcW w:type="dxa" w:w="5360"/>
+            <w:tcBorders>
+              <w:top w:val="single" w:color="A6A6A6" w:sz="4"/>
+              <w:left w:val="single" w:color="A6A6A6" w:sz="4"/>
+              <w:bottom w:val="single" w:color="A6A6A6" w:sz="4"/>
+              <w:right w:val="single" w:color="A6A6A6" w:sz="4"/>
+            </w:tcBorders>
+            <w:tcMar>
+              <w:top w:type="dxa" w:w="50"/>
+              <w:left w:type="dxa" w:w="90"/>
+              <w:bottom w:type="dxa" w:w="50"/>
+              <w:right w:type="dxa" w:w="90"/>
+            </w:tcMar>
+          </w:tcPr>
+          <w:p>
+            <w:r>
+              <w:rPr>
+                <w:rFonts w:ascii="Calibri" w:cs="Calibri" w:eastAsia="Calibri" w:hAnsi="Calibri"/>
+                <w:sz w:val="19"/>
+                <w:szCs w:val="19"/>
+              </w:rPr>
+              <w:t xml:space="preserve">ESP32 GPIO26 / 25 / 22 on U7.17 / 18 / 19: I2S</w:t>
+            </w:r>
+          </w:p>
+        </w:tc>
+      </w:tr>
+      <w:tr>
+        <w:tc>
+          <w:tcPr>
+            <w:tcW w:type="dxa" w:w="2500"/>
+            <w:tcBorders>
+              <w:top w:val="single" w:color="A6A6A6" w:sz="4"/>
+              <w:left w:val="single" w:color="A6A6A6" w:sz="4"/>
+              <w:bottom w:val="single" w:color="A6A6A6" w:sz="4"/>
+              <w:right w:val="single" w:color="A6A6A6" w:sz="4"/>
+            </w:tcBorders>
+            <w:tcMar>
+              <w:top w:type="dxa" w:w="50"/>
+              <w:left w:type="dxa" w:w="90"/>
+              <w:bottom w:type="dxa" w:w="50"/>
+              <w:right w:type="dxa" w:w="90"/>
+            </w:tcMar>
+          </w:tcPr>
+          <w:p>
+            <w:r>
+              <w:rPr>
+                <w:rFonts w:ascii="Calibri" w:cs="Calibri" w:eastAsia="Calibri" w:hAnsi="Calibri"/>
+                <w:sz w:val="19"/>
+                <w:szCs w:val="19"/>
+              </w:rPr>
+              <w:t xml:space="preserve">BT_TX (out) / BT_RX (in)</w:t>
+            </w:r>
+          </w:p>
+        </w:tc>
+        <w:tc>
+          <w:tcPr>
+            <w:tcW w:type="dxa" w:w="1500"/>
+            <w:tcBorders>
+              <w:top w:val="single" w:color="A6A6A6" w:sz="4"/>
+              <w:left w:val="single" w:color="A6A6A6" w:sz="4"/>
+              <w:bottom w:val="single" w:color="A6A6A6" w:sz="4"/>
+              <w:right w:val="single" w:color="A6A6A6" w:sz="4"/>
+            </w:tcBorders>
+            <w:tcMar>
+              <w:top w:type="dxa" w:w="50"/>
+              <w:left w:type="dxa" w:w="90"/>
+              <w:bottom w:type="dxa" w:w="50"/>
+              <w:right w:type="dxa" w:w="90"/>
+            </w:tcMar>
+          </w:tcPr>
+          <w:p>
+            <w:r>
+              <w:rPr>
+                <w:rFonts w:ascii="Calibri" w:cs="Calibri" w:eastAsia="Calibri" w:hAnsi="Calibri"/>
+                <w:sz w:val="19"/>
+                <w:szCs w:val="19"/>
+              </w:rPr>
+              <w:t xml:space="preserve">F2 / E1</w:t>
+            </w:r>
+          </w:p>
+        </w:tc>
+        <w:tc>
+          <w:tcPr>
+            <w:tcW w:type="dxa" w:w="5360"/>
+            <w:tcBorders>
+              <w:top w:val="single" w:color="A6A6A6" w:sz="4"/>
+              <w:left w:val="single" w:color="A6A6A6" w:sz="4"/>
+              <w:bottom w:val="single" w:color="A6A6A6" w:sz="4"/>
+              <w:right w:val="single" w:color="A6A6A6" w:sz="4"/>
+            </w:tcBorders>
+            <w:tcMar>
+              <w:top w:type="dxa" w:w="50"/>
+              <w:left w:type="dxa" w:w="90"/>
+              <w:bottom w:type="dxa" w:w="50"/>
+              <w:right w:type="dxa" w:w="90"/>
+            </w:tcMar>
+          </w:tcPr>
+          <w:p>
+            <w:r>
+              <w:rPr>
+                <w:rFonts w:ascii="Calibri" w:cs="Calibri" w:eastAsia="Calibri" w:hAnsi="Calibri"/>
+                <w:sz w:val="19"/>
+                <w:szCs w:val="19"/>
+              </w:rPr>
+              <w:t xml:space="preserve">ESP32 GPIO16 (RX2) / GPIO17 (TX2) on U7.20 / 21: UART</w:t>
             </w:r>
           </w:p>
         </w:tc>
@@ -8423,7 +9213,7 @@
           <w:sz w:val="21"/>
           <w:szCs w:val="21"/>
         </w:rPr>
-        <w:t xml:space="preserve">All pins are 3.3-V LVTTL; unused pins are inputs. The full header map is in docs/BOARD_PINOUT.md.</w:t>
+        <w:t xml:space="preserve">All pins are 3.3-V LVTTL; unused pins are inputs. The full header map is in docs/BOARD_PINOUT.md; the wiring of everything is in ASpectrum_Connection.docx.</w:t>
       </w:r>
     </w:p>
     <w:p>
@@ -8431,14 +9221,14 @@
         <w:pStyle w:val="Heading1"/>
         <w:spacing w:after="120" w:before="320"/>
       </w:pPr>
-      <w:bookmarkStart w:name="_Toc23" w:id="23"/>
-      <w:r>
-        <w:rPr>
-          <w:rFonts w:ascii="Calibri" w:cs="Calibri" w:eastAsia="Calibri" w:hAnsi="Calibri"/>
-        </w:rPr>
-        <w:t xml:space="preserve">11. Timing constraints</w:t>
-      </w:r>
-      <w:bookmarkEnd w:id="23"/>
+      <w:bookmarkStart w:name="_Toc27" w:id="27"/>
+      <w:r>
+        <w:rPr>
+          <w:rFonts w:ascii="Calibri" w:cs="Calibri" w:eastAsia="Calibri" w:hAnsi="Calibri"/>
+        </w:rPr>
+        <w:t xml:space="preserve">12. Timing constraints</w:t>
+      </w:r>
+      <w:bookmarkEnd w:id="27"/>
     </w:p>
     <w:p>
       <w:pPr>
@@ -8527,7 +9317,7 @@
           <w:sz w:val="21"/>
           <w:szCs w:val="21"/>
         </w:rPr>
-        <w:t xml:space="preserve">Board inputs and slow outputs (buttons, switches, keyboard, joystick, audio, VGA DAC, SD card SPI) are false paths; the SPI protocol itself leaves several clocks of margin.</w:t>
+        <w:t xml:space="preserve">Board inputs and slow outputs (buttons, switches, keyboard, joystick, audio, VGA DAC, ESP32 link, Bluetooth I2S and UART) are false paths; the link oversamples SCK and leaves several clocks of margin, I2S and UART inputs are synchronised.</w:t>
       </w:r>
     </w:p>
     <w:p>
@@ -8535,14 +9325,14 @@
         <w:pStyle w:val="Heading1"/>
         <w:spacing w:after="120" w:before="320"/>
       </w:pPr>
-      <w:bookmarkStart w:name="_Toc24" w:id="24"/>
-      <w:r>
-        <w:rPr>
-          <w:rFonts w:ascii="Calibri" w:cs="Calibri" w:eastAsia="Calibri" w:hAnsi="Calibri"/>
-        </w:rPr>
-        <w:t xml:space="preserve">12. Verification</w:t>
-      </w:r>
-      <w:bookmarkEnd w:id="24"/>
+      <w:bookmarkStart w:name="_Toc28" w:id="28"/>
+      <w:r>
+        <w:rPr>
+          <w:rFonts w:ascii="Calibri" w:cs="Calibri" w:eastAsia="Calibri" w:hAnsi="Calibri"/>
+        </w:rPr>
+        <w:t xml:space="preserve">13. Verification</w:t>
+      </w:r>
+      <w:bookmarkEnd w:id="28"/>
     </w:p>
     <w:tbl>
       <w:tblPr>
@@ -8707,7 +9497,7 @@
                 <w:sz w:val="19"/>
                 <w:szCs w:val="19"/>
               </w:rPr>
-              <w:t xml:space="preserve">sim/run_loader_sim.sh</w:t>
+              <w:t xml:space="preserve">sim/run_esp_link_sim.sh</w:t>
             </w:r>
           </w:p>
         </w:tc>
@@ -8734,7 +9524,7 @@
                 <w:sz w:val="19"/>
                 <w:szCs w:val="19"/>
               </w:rPr>
-              <w:t xml:space="preserve">Tape loader with an SD card model: firmware boots, browser shown, a TZX with every block type is played T-state exact against the reference; stop block, continue, Stop key; recording started from the browser, a ROM-style save with the CPU hold, F12, file checked on the card image</w:t>
+              <w:t xml:space="preserve">Loader hardware driven over the SPI link by an ESP32 model: core ID, register writes and reads, OSD text, FIFO bursts, 256-byte memory writes and reads across a page, the error flag with slow commands, the interrupt on a key change</w:t>
             </w:r>
           </w:p>
         </w:tc>
@@ -8763,7 +9553,7 @@
                 <w:sz w:val="19"/>
                 <w:szCs w:val="19"/>
               </w:rPr>
-              <w:t xml:space="preserve">sim/run_tapeload_sim.sh</w:t>
+              <w:t xml:space="preserve">esp32/test/run_host_test.sh</w:t>
             </w:r>
           </w:p>
         </w:tc>
@@ -8790,7 +9580,7 @@
                 <w:sz w:val="19"/>
                 <w:szCs w:val="19"/>
               </w:rPr>
-              <w:t xml:space="preserve">Whole machine: the 128K "Tape Loader" loads and runs a BASIC program from the SD card image through the player (result pending at the time of writing)</w:t>
+              <w:t xml:space="preserve">Firmware on the PC against generated FAT16/FAT32 card images (fragmented files, long names): every listing and every TAP/TZX signal compared with an independent Python reference; recordings of real TAP files (noise, headerless, several saves, 1 s pauses in turbo, empty) written and checked by an independent FAT checker; snapshots: reference .z80 files (versions 1-3, 48K/128K, stored pages, bad files) loaded into a model of the hardware, and save + reload round trips checked by an independent .z80 decoder</w:t>
             </w:r>
           </w:p>
         </w:tc>
@@ -8819,7 +9609,7 @@
                 <w:sz w:val="19"/>
                 <w:szCs w:val="19"/>
               </w:rPr>
-              <w:t xml:space="preserve">fw/test/run_host_test.sh</w:t>
+              <w:t xml:space="preserve">sim/run_snap_sim.sh</w:t>
             </w:r>
           </w:p>
         </w:tc>
@@ -8846,7 +9636,7 @@
                 <w:sz w:val="19"/>
                 <w:szCs w:val="19"/>
               </w:rPr>
-              <w:t xml:space="preserve">Firmware on the PC against generated FAT16/FAT32 card images (fragmented files, long names): every listing and every TAP/TZX signal compared with an independent Python reference; recordings of real TAP files (noise, headerless, several saves, 1 s pauses in turbo, empty) written and checked by an independent FAT checker; snapshots: reference .z80 files (versions 1-3, 48K/128K, stored pages, bad files) loaded into a model of the hardware, and save + reload round trips checked by an independent .z80 decoder</w:t>
+              <w:t xml:space="preserve">zx_bus + T80 + SDRAM: a Z80 test program (prefixes, DD CB, block instructions, EXX, IM 2, HALT, paging, AY) run undisturbed, with random freezes and reads, and with random freezes and full restores (LOAD): identical results</w:t>
             </w:r>
           </w:p>
         </w:tc>
@@ -8875,7 +9665,7 @@
                 <w:sz w:val="19"/>
                 <w:szCs w:val="19"/>
               </w:rPr>
-              <w:t xml:space="preserve">sim/run_snap_sim.sh</w:t>
+              <w:t xml:space="preserve">sim/run_cont_sim.sh</w:t>
             </w:r>
           </w:p>
         </w:tc>
@@ -8902,7 +9692,7 @@
                 <w:sz w:val="19"/>
                 <w:szCs w:val="19"/>
               </w:rPr>
-              <w:t xml:space="preserve">zx_bus + T80 + SDRAM: a Z80 test program (prefixes, DD CB, block instructions, EXX, IM 2, HALT, paging, AY) run undisturbed, with random freezes and reads, and with random freezes and full restores (LOAD): identical results</w:t>
+              <w:t xml:space="preserve">zx_bus + T80 + SDRAM: 8,000 NOPs in contended RAM run 57 per line in the border and 41 per picture line (the known Spectrum result), 57 everywhere with contention off</w:t>
             </w:r>
           </w:p>
         </w:tc>
@@ -8931,7 +9721,7 @@
                 <w:sz w:val="19"/>
                 <w:szCs w:val="19"/>
               </w:rPr>
-              <w:t xml:space="preserve">sim/run_cont_sim.sh</w:t>
+              <w:t xml:space="preserve">sim/run_float_sim.sh</w:t>
             </w:r>
           </w:p>
         </w:tc>
@@ -8958,7 +9748,7 @@
                 <w:sz w:val="19"/>
                 <w:szCs w:val="19"/>
               </w:rPr>
-              <w:t xml:space="preserve">zx_bus + T80 + SDRAM: 8,000 NOPs in contended RAM run 57 per line in the border and 41 per picture line (the known Spectrum result), 57 everywhere with contention off</w:t>
+              <w:t xml:space="preserve">zx_bus + T80 + SDRAM: 6,000 IN A,(FF) against Fuse 1.6's rule for the 128K floating bus (read point after all I/O contention; incl. contended port addresses); all FF with it switched off</w:t>
             </w:r>
           </w:p>
         </w:tc>
@@ -8987,7 +9777,7 @@
                 <w:sz w:val="19"/>
                 <w:szCs w:val="19"/>
               </w:rPr>
-              <w:t xml:space="preserve">sim/run_float_sim.sh</w:t>
+              <w:t xml:space="preserve">sim/run_floatgame_sim.sh</w:t>
             </w:r>
           </w:p>
         </w:tc>
@@ -9014,7 +9804,7 @@
                 <w:sz w:val="19"/>
                 <w:szCs w:val="19"/>
               </w:rPr>
-              <w:t xml:space="preserve">zx_bus + T80 + SDRAM: 6,000 IN A,(FF) against Fuse 1.6's rule for the 128K floating bus (read point after all I/O contention; incl. contended port addresses); all FF with it switched off</w:t>
+              <w:t xml:space="preserve">zx_bus + T80 + SDRAM running a real game from a .z80 (default Sidewize): every floating-bus read and every exit of the game's sync loop compared with Fuse's rule (~1 minute per frame)</w:t>
             </w:r>
           </w:p>
         </w:tc>
@@ -9043,7 +9833,7 @@
                 <w:sz w:val="19"/>
                 <w:szCs w:val="19"/>
               </w:rPr>
-              <w:t xml:space="preserve">sim/run_floatgame_sim.sh</w:t>
+              <w:t xml:space="preserve">sim/run_bt_i2s_sim.sh</w:t>
             </w:r>
           </w:p>
         </w:tc>
@@ -9070,7 +9860,7 @@
                 <w:sz w:val="19"/>
                 <w:szCs w:val="19"/>
               </w:rPr>
-              <w:t xml:space="preserve">zx_bus + T80 + SDRAM running a real game from a .z80 (default Sidewize): every floating-bus read and every exit of the game's sync loop compared with Fuse's rule (~1 minute per frame)</w:t>
+              <w:t xml:space="preserve">bt_i2s against an ESP32-like I2S master with 16- and 32-bit slots: every word bit-exact, beeper swing centred on 0, DC removed</w:t>
             </w:r>
           </w:p>
         </w:tc>
@@ -9099,7 +9889,7 @@
                 <w:sz w:val="19"/>
                 <w:szCs w:val="19"/>
               </w:rPr>
-              <w:t xml:space="preserve">sim/run_snapsys_sim.sh</w:t>
+              <w:t xml:space="preserve">tests/Test_wires, tests/ESPLinkTest</w:t>
             </w:r>
           </w:p>
         </w:tc>
@@ -9126,7 +9916,7 @@
                 <w:sz w:val="19"/>
                 <w:szCs w:val="19"/>
               </w:rPr>
-              <w:t xml:space="preserve">Whole machine with the firmware: F2, a typed name, the snapshot written to the SD card model, F12 + Enter loads it back; loaded state equals the saved state; the file is checked by the independent decoder</w:t>
+              <w:t xml:space="preserve">Hardware tests: every ESP32-FPGA wire (levels, pulses, 8 MHz SPI, crosstalk) and the SD card; link throughput, memory round trips, keys and OSD test pages</w:t>
             </w:r>
           </w:p>
         </w:tc>
@@ -9238,7 +10028,7 @@
                 <w:sz w:val="19"/>
                 <w:szCs w:val="19"/>
               </w:rPr>
-              <w:t xml:space="preserve">128K boots and runs (6 October); games load from the SD card in turbo and at normal speed, saving to the card works (8 October); 60 Hz start, contention and the 50 Hz border alignment confirmed with Aquaplane, floating bus confirmed with Sidewize, snapshots save and load (9 October); floating bus read point corrected, Sidewize's player no longer flickers, Arkanoid and Cobra work (11 October)</w:t>
+              <w:t xml:space="preserve">128K boots and runs (6 October); games load from the SD card in turbo and at normal speed, saving to the card works (8 October); 60 Hz start, contention and the 50 Hz border alignment confirmed with Aquaplane, floating bus confirmed with Sidewize, snapshots save and load (9 October); floating bus read point corrected, Sidewize's player no longer flickers, Arkanoid and Cobra work (11 October); ESP32 with Bose headphones: connects, test tone plays (13 October); ESP32 as system controller: wiring, link, loading, saving, snapshots and the Bluetooth menu work (14 October)</w:t>
             </w:r>
           </w:p>
         </w:tc>
@@ -9249,14 +10039,14 @@
         <w:pStyle w:val="Heading1"/>
         <w:spacing w:after="120" w:before="320"/>
       </w:pPr>
-      <w:bookmarkStart w:name="_Toc25" w:id="25"/>
-      <w:r>
-        <w:rPr>
-          <w:rFonts w:ascii="Calibri" w:cs="Calibri" w:eastAsia="Calibri" w:hAnsi="Calibri"/>
-        </w:rPr>
-        <w:t xml:space="preserve">13. Known limitations</w:t>
-      </w:r>
-      <w:bookmarkEnd w:id="25"/>
+      <w:bookmarkStart w:name="_Toc29" w:id="29"/>
+      <w:r>
+        <w:rPr>
+          <w:rFonts w:ascii="Calibri" w:cs="Calibri" w:eastAsia="Calibri" w:hAnsi="Calibri"/>
+        </w:rPr>
+        <w:t xml:space="preserve">14. Known limitations</w:t>
+      </w:r>
+      <w:bookmarkEnd w:id="29"/>
     </w:p>
     <w:p>
       <w:pPr>
@@ -9309,7 +10099,7 @@
           <w:sz w:val="21"/>
           <w:szCs w:val="21"/>
         </w:rPr>
-        <w:t xml:space="preserve">Tape loader: TZX generalized data (0x19), CSW (0x18) and the select-block menu (0x28) are not played; text and message blocks are not shown; LOAD "" is not typed automatically; at most 350 entries per folder; exFAT cards are not supported.</w:t>
+        <w:t xml:space="preserve">Tape loader: TZX generalized data (0x19), CSW (0x18) and the select-block menu (0x28) are not played; text and message blocks are not shown; LOAD "" is not typed automatically; at most 320 entries per folder; exFAT cards are not supported.</w:t>
       </w:r>
     </w:p>
     <w:p>
@@ -9345,7 +10135,25 @@
           <w:sz w:val="21"/>
           <w:szCs w:val="21"/>
         </w:rPr>
-        <w:t xml:space="preserve">Block RAM: 55 of 56 M9K are used.</w:t>
+        <w:t xml:space="preserve">The ESP32 is needed for the SD card, the browser, saving, snapshots and Bluetooth; without it the Spectrum boots and runs, but F12 does nothing.</w:t>
+      </w:r>
+    </w:p>
+    <w:p>
+      <w:pPr>
+        <w:pStyle w:val="ListParagraph"/>
+        <w:numPr>
+          <w:ilvl w:val="0"/>
+          <w:numId w:val="2"/>
+        </w:numPr>
+        <w:spacing w:after="50"/>
+      </w:pPr>
+      <w:r>
+        <w:rPr>
+          <w:rFonts w:ascii="Calibri" w:cs="Calibri" w:eastAsia="Calibri" w:hAnsi="Calibri"/>
+          <w:sz w:val="21"/>
+          <w:szCs w:val="21"/>
+        </w:rPr>
+        <w:t xml:space="preserve">Bluetooth: mono, about 0.2 s of delay; the ESP32 needs its own power (USB or 5 V on VIN).</w:t>
       </w:r>
     </w:p>
     <w:sectPr>

</xml_diff>